<commit_message>
Update database design documentation
</commit_message>
<xml_diff>
--- a/DDD.docx
+++ b/DDD.docx
@@ -2,6 +2,1719 @@
 <file path=word/document.xml><?xml version="1.0" encoding="utf-8"?>
 <w:document xmlns:wpc="http://schemas.microsoft.com/office/word/2010/wordprocessingCanvas" xmlns:cx="http://schemas.microsoft.com/office/drawing/2014/chartex" xmlns:cx1="http://schemas.microsoft.com/office/drawing/2015/9/8/chartex" xmlns:cx2="http://schemas.microsoft.com/office/drawing/2015/10/21/chartex" xmlns:cx3="http://schemas.microsoft.com/office/drawing/2016/5/9/chartex" xmlns:cx4="http://schemas.microsoft.com/office/drawing/2016/5/10/chartex" xmlns:cx5="http://schemas.microsoft.com/office/drawing/2016/5/11/chartex" xmlns:cx6="http://schemas.microsoft.com/office/drawing/2016/5/12/chartex" xmlns:cx7="http://schemas.microsoft.com/office/drawing/2016/5/13/chartex" xmlns:cx8="http://schemas.microsoft.com/office/drawing/2016/5/14/chartex" xmlns:mc="http://schemas.openxmlformats.org/markup-compatibility/2006" xmlns:aink="http://schemas.microsoft.com/office/drawing/2016/ink" xmlns:am3d="http://schemas.microsoft.com/office/drawing/2017/model3d" xmlns:o="urn:schemas-microsoft-com:office:office" xmlns:oel="http://schemas.microsoft.com/office/2019/extlst" xmlns:r="http://schemas.openxmlformats.org/officeDocument/2006/relationships" xmlns:m="http://schemas.openxmlformats.org/officeDocument/2006/math" xmlns:v="urn:schemas-microsoft-com:vml" xmlns:wp14="http://schemas.microsoft.com/office/word/2010/wordprocessingDrawing" xmlns:wp="http://schemas.openxmlformats.org/drawingml/2006/wordprocessingDrawing" xmlns:w10="urn:schemas-microsoft-com:office:word" xmlns:w="http://schemas.openxmlformats.org/wordprocessingml/2006/main" xmlns:w14="http://schemas.microsoft.com/office/word/2010/wordml" xmlns:w15="http://schemas.microsoft.com/office/word/2012/wordml" xmlns:w16cex="http://schemas.microsoft.com/office/word/2018/wordml/cex" xmlns:w16cid="http://schemas.microsoft.com/office/word/2016/wordml/cid" xmlns:w16="http://schemas.microsoft.com/office/word/2018/wordml" xmlns:w16du="http://schemas.microsoft.com/office/word/2023/wordml/word16du" xmlns:w16sdtdh="http://schemas.microsoft.com/office/word/2020/wordml/sdtdatahash" xmlns:w16sdtfl="http://schemas.microsoft.com/office/word/2024/wordml/sdtformatlock" xmlns:w16se="http://schemas.microsoft.com/office/word/2015/wordml/symex" xmlns:wpg="http://schemas.microsoft.com/office/word/2010/wordprocessingGroup" xmlns:wpi="http://schemas.microsoft.com/office/word/2010/wordprocessingInk" xmlns:wne="http://schemas.microsoft.com/office/word/2006/wordml" xmlns:wps="http://schemas.microsoft.com/office/word/2010/wordprocessingShape" mc:Ignorable="w14 w15 w16se w16cid w16 w16cex w16sdtdh w16sdtfl w16du wp14">
   <w:body>
+    <w:p>
+      <w:pPr>
+        <w:rPr>
+          <w:b/>
+          <w:bCs/>
+        </w:rPr>
+      </w:pPr>
+      <w:r>
+        <w:rPr>
+          <w:b/>
+          <w:bCs/>
+        </w:rPr>
+        <w:t>2.ERD (schema.png)</w:t>
+      </w:r>
+    </w:p>
+    <w:p>
+      <w:r>
+        <w:t>Relationships between tables</w:t>
+      </w:r>
+    </w:p>
+    <w:p>
+      <w:pPr>
+        <w:rPr>
+          <w:b/>
+          <w:bCs/>
+        </w:rPr>
+      </w:pPr>
+      <w:proofErr w:type="spellStart"/>
+      <w:r>
+        <w:rPr>
+          <w:b/>
+          <w:bCs/>
+        </w:rPr>
+        <w:t>event_category</w:t>
+      </w:r>
+      <w:proofErr w:type="spellEnd"/>
+      <w:r>
+        <w:rPr>
+          <w:b/>
+          <w:bCs/>
+        </w:rPr>
+        <w:t> – event</w:t>
+      </w:r>
+    </w:p>
+    <w:p>
+      <w:pPr>
+        <w:numPr>
+          <w:ilvl w:val="0"/>
+          <w:numId w:val="4"/>
+        </w:numPr>
+      </w:pPr>
+      <w:proofErr w:type="spellStart"/>
+      <w:r>
+        <w:t>Một</w:t>
+      </w:r>
+      <w:proofErr w:type="spellEnd"/>
+      <w:r>
+        <w:t xml:space="preserve"> </w:t>
+      </w:r>
+      <w:proofErr w:type="spellStart"/>
+      <w:r>
+        <w:t>danh</w:t>
+      </w:r>
+      <w:proofErr w:type="spellEnd"/>
+      <w:r>
+        <w:t xml:space="preserve"> </w:t>
+      </w:r>
+      <w:proofErr w:type="spellStart"/>
+      <w:r>
+        <w:t>mục</w:t>
+      </w:r>
+      <w:proofErr w:type="spellEnd"/>
+      <w:r>
+        <w:t xml:space="preserve"> </w:t>
+      </w:r>
+      <w:proofErr w:type="spellStart"/>
+      <w:r>
+        <w:t>có</w:t>
+      </w:r>
+      <w:proofErr w:type="spellEnd"/>
+      <w:r>
+        <w:t xml:space="preserve"> </w:t>
+      </w:r>
+      <w:proofErr w:type="spellStart"/>
+      <w:r>
+        <w:t>thể</w:t>
+      </w:r>
+      <w:proofErr w:type="spellEnd"/>
+      <w:r>
+        <w:t xml:space="preserve"> </w:t>
+      </w:r>
+      <w:proofErr w:type="spellStart"/>
+      <w:r>
+        <w:t>gồm</w:t>
+      </w:r>
+      <w:proofErr w:type="spellEnd"/>
+      <w:r>
+        <w:t xml:space="preserve"> </w:t>
+      </w:r>
+      <w:proofErr w:type="spellStart"/>
+      <w:r>
+        <w:t>nhiều</w:t>
+      </w:r>
+      <w:proofErr w:type="spellEnd"/>
+      <w:r>
+        <w:t xml:space="preserve"> sự </w:t>
+      </w:r>
+      <w:proofErr w:type="spellStart"/>
+      <w:r>
+        <w:t>kiện</w:t>
+      </w:r>
+      <w:proofErr w:type="spellEnd"/>
+      <w:r>
+        <w:t xml:space="preserve">; </w:t>
+      </w:r>
+      <w:proofErr w:type="spellStart"/>
+      <w:r>
+        <w:t>mỗi</w:t>
+      </w:r>
+      <w:proofErr w:type="spellEnd"/>
+      <w:r>
+        <w:t xml:space="preserve"> sự </w:t>
+      </w:r>
+      <w:proofErr w:type="spellStart"/>
+      <w:r>
+        <w:t>kiện</w:t>
+      </w:r>
+      <w:proofErr w:type="spellEnd"/>
+      <w:r>
+        <w:t xml:space="preserve"> </w:t>
+      </w:r>
+      <w:proofErr w:type="spellStart"/>
+      <w:r>
+        <w:t>thuộc</w:t>
+      </w:r>
+      <w:proofErr w:type="spellEnd"/>
+      <w:r>
+        <w:t xml:space="preserve"> </w:t>
+      </w:r>
+      <w:proofErr w:type="spellStart"/>
+      <w:r>
+        <w:t>một</w:t>
+      </w:r>
+      <w:proofErr w:type="spellEnd"/>
+      <w:r>
+        <w:t xml:space="preserve"> </w:t>
+      </w:r>
+      <w:proofErr w:type="spellStart"/>
+      <w:r>
+        <w:t>danh</w:t>
+      </w:r>
+      <w:proofErr w:type="spellEnd"/>
+      <w:r>
+        <w:t xml:space="preserve"> </w:t>
+      </w:r>
+      <w:proofErr w:type="spellStart"/>
+      <w:r>
+        <w:t>mục</w:t>
+      </w:r>
+      <w:proofErr w:type="spellEnd"/>
+      <w:r>
+        <w:t>. </w:t>
+      </w:r>
+      <w:r>
+        <w:rPr>
+          <w:b/>
+          <w:bCs/>
+        </w:rPr>
+        <w:t>(</w:t>
+      </w:r>
+      <w:proofErr w:type="gramStart"/>
+      <w:r>
+        <w:rPr>
+          <w:b/>
+          <w:bCs/>
+        </w:rPr>
+        <w:t>1:N</w:t>
+      </w:r>
+      <w:proofErr w:type="gramEnd"/>
+      <w:r>
+        <w:rPr>
+          <w:b/>
+          <w:bCs/>
+        </w:rPr>
+        <w:t>)</w:t>
+      </w:r>
+    </w:p>
+    <w:p>
+      <w:pPr>
+        <w:rPr>
+          <w:b/>
+          <w:bCs/>
+        </w:rPr>
+      </w:pPr>
+      <w:r>
+        <w:rPr>
+          <w:b/>
+          <w:bCs/>
+        </w:rPr>
+        <w:t>venue – event</w:t>
+      </w:r>
+    </w:p>
+    <w:p>
+      <w:pPr>
+        <w:numPr>
+          <w:ilvl w:val="0"/>
+          <w:numId w:val="5"/>
+        </w:numPr>
+      </w:pPr>
+      <w:proofErr w:type="spellStart"/>
+      <w:r>
+        <w:t>Một</w:t>
+      </w:r>
+      <w:proofErr w:type="spellEnd"/>
+      <w:r>
+        <w:t xml:space="preserve"> </w:t>
+      </w:r>
+      <w:proofErr w:type="spellStart"/>
+      <w:r>
+        <w:t>địa</w:t>
+      </w:r>
+      <w:proofErr w:type="spellEnd"/>
+      <w:r>
+        <w:t xml:space="preserve"> </w:t>
+      </w:r>
+      <w:proofErr w:type="spellStart"/>
+      <w:r>
+        <w:t>điểm</w:t>
+      </w:r>
+      <w:proofErr w:type="spellEnd"/>
+      <w:r>
+        <w:t xml:space="preserve"> </w:t>
+      </w:r>
+      <w:proofErr w:type="spellStart"/>
+      <w:r>
+        <w:t>có</w:t>
+      </w:r>
+      <w:proofErr w:type="spellEnd"/>
+      <w:r>
+        <w:t xml:space="preserve"> </w:t>
+      </w:r>
+      <w:proofErr w:type="spellStart"/>
+      <w:r>
+        <w:t>thể</w:t>
+      </w:r>
+      <w:proofErr w:type="spellEnd"/>
+      <w:r>
+        <w:t xml:space="preserve"> </w:t>
+      </w:r>
+      <w:proofErr w:type="spellStart"/>
+      <w:r>
+        <w:t>tổ</w:t>
+      </w:r>
+      <w:proofErr w:type="spellEnd"/>
+      <w:r>
+        <w:t xml:space="preserve"> </w:t>
+      </w:r>
+      <w:proofErr w:type="spellStart"/>
+      <w:r>
+        <w:t>chức</w:t>
+      </w:r>
+      <w:proofErr w:type="spellEnd"/>
+      <w:r>
+        <w:t xml:space="preserve"> </w:t>
+      </w:r>
+      <w:proofErr w:type="spellStart"/>
+      <w:r>
+        <w:t>nhiều</w:t>
+      </w:r>
+      <w:proofErr w:type="spellEnd"/>
+      <w:r>
+        <w:t xml:space="preserve"> sự </w:t>
+      </w:r>
+      <w:proofErr w:type="spellStart"/>
+      <w:r>
+        <w:t>kiện</w:t>
+      </w:r>
+      <w:proofErr w:type="spellEnd"/>
+      <w:r>
+        <w:t xml:space="preserve">; </w:t>
+      </w:r>
+      <w:proofErr w:type="spellStart"/>
+      <w:r>
+        <w:t>mỗi</w:t>
+      </w:r>
+      <w:proofErr w:type="spellEnd"/>
+      <w:r>
+        <w:t xml:space="preserve"> sự </w:t>
+      </w:r>
+      <w:proofErr w:type="spellStart"/>
+      <w:r>
+        <w:t>kiện</w:t>
+      </w:r>
+      <w:proofErr w:type="spellEnd"/>
+      <w:r>
+        <w:t xml:space="preserve"> </w:t>
+      </w:r>
+      <w:proofErr w:type="spellStart"/>
+      <w:r>
+        <w:t>diễn</w:t>
+      </w:r>
+      <w:proofErr w:type="spellEnd"/>
+      <w:r>
+        <w:t xml:space="preserve"> </w:t>
+      </w:r>
+      <w:proofErr w:type="spellStart"/>
+      <w:r>
+        <w:t>ra</w:t>
+      </w:r>
+      <w:proofErr w:type="spellEnd"/>
+      <w:r>
+        <w:t xml:space="preserve"> </w:t>
+      </w:r>
+      <w:proofErr w:type="spellStart"/>
+      <w:r>
+        <w:t>tại</w:t>
+      </w:r>
+      <w:proofErr w:type="spellEnd"/>
+      <w:r>
+        <w:t xml:space="preserve"> </w:t>
+      </w:r>
+      <w:proofErr w:type="spellStart"/>
+      <w:r>
+        <w:t>một</w:t>
+      </w:r>
+      <w:proofErr w:type="spellEnd"/>
+      <w:r>
+        <w:t xml:space="preserve"> </w:t>
+      </w:r>
+      <w:proofErr w:type="spellStart"/>
+      <w:r>
+        <w:t>địa</w:t>
+      </w:r>
+      <w:proofErr w:type="spellEnd"/>
+      <w:r>
+        <w:t xml:space="preserve"> </w:t>
+      </w:r>
+      <w:proofErr w:type="spellStart"/>
+      <w:r>
+        <w:t>điểm</w:t>
+      </w:r>
+      <w:proofErr w:type="spellEnd"/>
+      <w:r>
+        <w:t>. </w:t>
+      </w:r>
+      <w:r>
+        <w:rPr>
+          <w:b/>
+          <w:bCs/>
+        </w:rPr>
+        <w:t>(</w:t>
+      </w:r>
+      <w:proofErr w:type="gramStart"/>
+      <w:r>
+        <w:rPr>
+          <w:b/>
+          <w:bCs/>
+        </w:rPr>
+        <w:t>1:N</w:t>
+      </w:r>
+      <w:proofErr w:type="gramEnd"/>
+      <w:r>
+        <w:rPr>
+          <w:b/>
+          <w:bCs/>
+        </w:rPr>
+        <w:t>)</w:t>
+      </w:r>
+    </w:p>
+    <w:p>
+      <w:pPr>
+        <w:rPr>
+          <w:b/>
+          <w:bCs/>
+        </w:rPr>
+      </w:pPr>
+      <w:r>
+        <w:rPr>
+          <w:b/>
+          <w:bCs/>
+        </w:rPr>
+        <w:t>event – </w:t>
+      </w:r>
+      <w:proofErr w:type="spellStart"/>
+      <w:r>
+        <w:rPr>
+          <w:b/>
+          <w:bCs/>
+        </w:rPr>
+        <w:t>ticket_type</w:t>
+      </w:r>
+      <w:proofErr w:type="spellEnd"/>
+    </w:p>
+    <w:p>
+      <w:pPr>
+        <w:numPr>
+          <w:ilvl w:val="0"/>
+          <w:numId w:val="6"/>
+        </w:numPr>
+      </w:pPr>
+      <w:proofErr w:type="spellStart"/>
+      <w:r>
+        <w:t>Một</w:t>
+      </w:r>
+      <w:proofErr w:type="spellEnd"/>
+      <w:r>
+        <w:t xml:space="preserve"> sự </w:t>
+      </w:r>
+      <w:proofErr w:type="spellStart"/>
+      <w:r>
+        <w:t>kiện</w:t>
+      </w:r>
+      <w:proofErr w:type="spellEnd"/>
+      <w:r>
+        <w:t xml:space="preserve"> </w:t>
+      </w:r>
+      <w:proofErr w:type="spellStart"/>
+      <w:r>
+        <w:t>có</w:t>
+      </w:r>
+      <w:proofErr w:type="spellEnd"/>
+      <w:r>
+        <w:t xml:space="preserve"> </w:t>
+      </w:r>
+      <w:proofErr w:type="spellStart"/>
+      <w:r>
+        <w:t>thể</w:t>
+      </w:r>
+      <w:proofErr w:type="spellEnd"/>
+      <w:r>
+        <w:t xml:space="preserve"> </w:t>
+      </w:r>
+      <w:proofErr w:type="spellStart"/>
+      <w:r>
+        <w:t>có</w:t>
+      </w:r>
+      <w:proofErr w:type="spellEnd"/>
+      <w:r>
+        <w:t xml:space="preserve"> </w:t>
+      </w:r>
+      <w:proofErr w:type="spellStart"/>
+      <w:r>
+        <w:t>nhiều</w:t>
+      </w:r>
+      <w:proofErr w:type="spellEnd"/>
+      <w:r>
+        <w:t xml:space="preserve"> </w:t>
+      </w:r>
+      <w:proofErr w:type="spellStart"/>
+      <w:r>
+        <w:t>loại</w:t>
+      </w:r>
+      <w:proofErr w:type="spellEnd"/>
+      <w:r>
+        <w:t xml:space="preserve"> </w:t>
+      </w:r>
+      <w:proofErr w:type="spellStart"/>
+      <w:r>
+        <w:t>vé</w:t>
+      </w:r>
+      <w:proofErr w:type="spellEnd"/>
+      <w:r>
+        <w:t xml:space="preserve">; </w:t>
+      </w:r>
+      <w:proofErr w:type="spellStart"/>
+      <w:r>
+        <w:t>mỗi</w:t>
+      </w:r>
+      <w:proofErr w:type="spellEnd"/>
+      <w:r>
+        <w:t xml:space="preserve"> </w:t>
+      </w:r>
+      <w:proofErr w:type="spellStart"/>
+      <w:r>
+        <w:t>loại</w:t>
+      </w:r>
+      <w:proofErr w:type="spellEnd"/>
+      <w:r>
+        <w:t xml:space="preserve"> </w:t>
+      </w:r>
+      <w:proofErr w:type="spellStart"/>
+      <w:r>
+        <w:t>vé</w:t>
+      </w:r>
+      <w:proofErr w:type="spellEnd"/>
+      <w:r>
+        <w:t xml:space="preserve"> </w:t>
+      </w:r>
+      <w:proofErr w:type="spellStart"/>
+      <w:r>
+        <w:t>thuộc</w:t>
+      </w:r>
+      <w:proofErr w:type="spellEnd"/>
+      <w:r>
+        <w:t xml:space="preserve"> </w:t>
+      </w:r>
+      <w:proofErr w:type="spellStart"/>
+      <w:r>
+        <w:t>về</w:t>
+      </w:r>
+      <w:proofErr w:type="spellEnd"/>
+      <w:r>
+        <w:t xml:space="preserve"> </w:t>
+      </w:r>
+      <w:proofErr w:type="spellStart"/>
+      <w:r>
+        <w:t>một</w:t>
+      </w:r>
+      <w:proofErr w:type="spellEnd"/>
+      <w:r>
+        <w:t xml:space="preserve"> sự </w:t>
+      </w:r>
+      <w:proofErr w:type="spellStart"/>
+      <w:r>
+        <w:t>kiện</w:t>
+      </w:r>
+      <w:proofErr w:type="spellEnd"/>
+      <w:r>
+        <w:t>. </w:t>
+      </w:r>
+      <w:r>
+        <w:rPr>
+          <w:b/>
+          <w:bCs/>
+        </w:rPr>
+        <w:t>(</w:t>
+      </w:r>
+      <w:proofErr w:type="gramStart"/>
+      <w:r>
+        <w:rPr>
+          <w:b/>
+          <w:bCs/>
+        </w:rPr>
+        <w:t>1:N</w:t>
+      </w:r>
+      <w:proofErr w:type="gramEnd"/>
+      <w:r>
+        <w:rPr>
+          <w:b/>
+          <w:bCs/>
+        </w:rPr>
+        <w:t>)</w:t>
+      </w:r>
+    </w:p>
+    <w:p>
+      <w:pPr>
+        <w:rPr>
+          <w:b/>
+          <w:bCs/>
+        </w:rPr>
+      </w:pPr>
+      <w:r>
+        <w:rPr>
+          <w:b/>
+          <w:bCs/>
+        </w:rPr>
+        <w:t>customer – </w:t>
+      </w:r>
+      <w:proofErr w:type="spellStart"/>
+      <w:r>
+        <w:rPr>
+          <w:b/>
+          <w:bCs/>
+        </w:rPr>
+        <w:t>ticket_order</w:t>
+      </w:r>
+      <w:proofErr w:type="spellEnd"/>
+    </w:p>
+    <w:p>
+      <w:pPr>
+        <w:numPr>
+          <w:ilvl w:val="0"/>
+          <w:numId w:val="7"/>
+        </w:numPr>
+      </w:pPr>
+      <w:proofErr w:type="spellStart"/>
+      <w:r>
+        <w:t>Một</w:t>
+      </w:r>
+      <w:proofErr w:type="spellEnd"/>
+      <w:r>
+        <w:t xml:space="preserve"> </w:t>
+      </w:r>
+      <w:proofErr w:type="spellStart"/>
+      <w:r>
+        <w:t>khách</w:t>
+      </w:r>
+      <w:proofErr w:type="spellEnd"/>
+      <w:r>
+        <w:t xml:space="preserve"> </w:t>
+      </w:r>
+      <w:proofErr w:type="spellStart"/>
+      <w:r>
+        <w:t>hàng</w:t>
+      </w:r>
+      <w:proofErr w:type="spellEnd"/>
+      <w:r>
+        <w:t xml:space="preserve"> </w:t>
+      </w:r>
+      <w:proofErr w:type="spellStart"/>
+      <w:r>
+        <w:t>có</w:t>
+      </w:r>
+      <w:proofErr w:type="spellEnd"/>
+      <w:r>
+        <w:t xml:space="preserve"> </w:t>
+      </w:r>
+      <w:proofErr w:type="spellStart"/>
+      <w:r>
+        <w:t>thể</w:t>
+      </w:r>
+      <w:proofErr w:type="spellEnd"/>
+      <w:r>
+        <w:t xml:space="preserve"> </w:t>
+      </w:r>
+      <w:proofErr w:type="spellStart"/>
+      <w:r>
+        <w:t>tạo</w:t>
+      </w:r>
+      <w:proofErr w:type="spellEnd"/>
+      <w:r>
+        <w:t xml:space="preserve"> </w:t>
+      </w:r>
+      <w:proofErr w:type="spellStart"/>
+      <w:r>
+        <w:t>nhiều</w:t>
+      </w:r>
+      <w:proofErr w:type="spellEnd"/>
+      <w:r>
+        <w:t xml:space="preserve"> </w:t>
+      </w:r>
+      <w:proofErr w:type="spellStart"/>
+      <w:r>
+        <w:t>đơn</w:t>
+      </w:r>
+      <w:proofErr w:type="spellEnd"/>
+      <w:r>
+        <w:t xml:space="preserve"> </w:t>
+      </w:r>
+      <w:proofErr w:type="spellStart"/>
+      <w:r>
+        <w:t>hàng</w:t>
+      </w:r>
+      <w:proofErr w:type="spellEnd"/>
+      <w:r>
+        <w:t xml:space="preserve">; </w:t>
+      </w:r>
+      <w:proofErr w:type="spellStart"/>
+      <w:r>
+        <w:t>mỗi</w:t>
+      </w:r>
+      <w:proofErr w:type="spellEnd"/>
+      <w:r>
+        <w:t xml:space="preserve"> </w:t>
+      </w:r>
+      <w:proofErr w:type="spellStart"/>
+      <w:r>
+        <w:t>đơn</w:t>
+      </w:r>
+      <w:proofErr w:type="spellEnd"/>
+      <w:r>
+        <w:t xml:space="preserve"> </w:t>
+      </w:r>
+      <w:proofErr w:type="spellStart"/>
+      <w:r>
+        <w:t>hàng</w:t>
+      </w:r>
+      <w:proofErr w:type="spellEnd"/>
+      <w:r>
+        <w:t xml:space="preserve"> </w:t>
+      </w:r>
+      <w:proofErr w:type="spellStart"/>
+      <w:r>
+        <w:t>thuộc</w:t>
+      </w:r>
+      <w:proofErr w:type="spellEnd"/>
+      <w:r>
+        <w:t xml:space="preserve"> </w:t>
+      </w:r>
+      <w:proofErr w:type="spellStart"/>
+      <w:r>
+        <w:t>về</w:t>
+      </w:r>
+      <w:proofErr w:type="spellEnd"/>
+      <w:r>
+        <w:t xml:space="preserve"> </w:t>
+      </w:r>
+      <w:proofErr w:type="spellStart"/>
+      <w:r>
+        <w:t>một</w:t>
+      </w:r>
+      <w:proofErr w:type="spellEnd"/>
+      <w:r>
+        <w:t xml:space="preserve"> </w:t>
+      </w:r>
+      <w:proofErr w:type="spellStart"/>
+      <w:r>
+        <w:t>khách</w:t>
+      </w:r>
+      <w:proofErr w:type="spellEnd"/>
+      <w:r>
+        <w:t xml:space="preserve"> </w:t>
+      </w:r>
+      <w:proofErr w:type="spellStart"/>
+      <w:r>
+        <w:t>hàng</w:t>
+      </w:r>
+      <w:proofErr w:type="spellEnd"/>
+      <w:r>
+        <w:t>. </w:t>
+      </w:r>
+      <w:r>
+        <w:rPr>
+          <w:b/>
+          <w:bCs/>
+        </w:rPr>
+        <w:t>(</w:t>
+      </w:r>
+      <w:proofErr w:type="gramStart"/>
+      <w:r>
+        <w:rPr>
+          <w:b/>
+          <w:bCs/>
+        </w:rPr>
+        <w:t>1:N</w:t>
+      </w:r>
+      <w:proofErr w:type="gramEnd"/>
+      <w:r>
+        <w:rPr>
+          <w:b/>
+          <w:bCs/>
+        </w:rPr>
+        <w:t>)</w:t>
+      </w:r>
+    </w:p>
+    <w:p>
+      <w:pPr>
+        <w:rPr>
+          <w:b/>
+          <w:bCs/>
+        </w:rPr>
+      </w:pPr>
+      <w:proofErr w:type="spellStart"/>
+      <w:r>
+        <w:rPr>
+          <w:b/>
+          <w:bCs/>
+        </w:rPr>
+        <w:t>ticket_order</w:t>
+      </w:r>
+      <w:proofErr w:type="spellEnd"/>
+      <w:r>
+        <w:rPr>
+          <w:b/>
+          <w:bCs/>
+        </w:rPr>
+        <w:t> – </w:t>
+      </w:r>
+      <w:proofErr w:type="spellStart"/>
+      <w:r>
+        <w:rPr>
+          <w:b/>
+          <w:bCs/>
+        </w:rPr>
+        <w:t>order_item</w:t>
+      </w:r>
+      <w:proofErr w:type="spellEnd"/>
+    </w:p>
+    <w:p>
+      <w:pPr>
+        <w:numPr>
+          <w:ilvl w:val="0"/>
+          <w:numId w:val="8"/>
+        </w:numPr>
+      </w:pPr>
+      <w:proofErr w:type="spellStart"/>
+      <w:r>
+        <w:t>Một</w:t>
+      </w:r>
+      <w:proofErr w:type="spellEnd"/>
+      <w:r>
+        <w:t xml:space="preserve"> </w:t>
+      </w:r>
+      <w:proofErr w:type="spellStart"/>
+      <w:r>
+        <w:t>đơn</w:t>
+      </w:r>
+      <w:proofErr w:type="spellEnd"/>
+      <w:r>
+        <w:t xml:space="preserve"> </w:t>
+      </w:r>
+      <w:proofErr w:type="spellStart"/>
+      <w:r>
+        <w:t>hàng</w:t>
+      </w:r>
+      <w:proofErr w:type="spellEnd"/>
+      <w:r>
+        <w:t xml:space="preserve"> </w:t>
+      </w:r>
+      <w:proofErr w:type="spellStart"/>
+      <w:r>
+        <w:t>có</w:t>
+      </w:r>
+      <w:proofErr w:type="spellEnd"/>
+      <w:r>
+        <w:t xml:space="preserve"> </w:t>
+      </w:r>
+      <w:proofErr w:type="spellStart"/>
+      <w:r>
+        <w:t>thể</w:t>
+      </w:r>
+      <w:proofErr w:type="spellEnd"/>
+      <w:r>
+        <w:t xml:space="preserve"> </w:t>
+      </w:r>
+      <w:proofErr w:type="spellStart"/>
+      <w:r>
+        <w:t>gồm</w:t>
+      </w:r>
+      <w:proofErr w:type="spellEnd"/>
+      <w:r>
+        <w:t xml:space="preserve"> </w:t>
+      </w:r>
+      <w:proofErr w:type="spellStart"/>
+      <w:r>
+        <w:t>nhiều</w:t>
+      </w:r>
+      <w:proofErr w:type="spellEnd"/>
+      <w:r>
+        <w:t xml:space="preserve"> chi </w:t>
+      </w:r>
+      <w:proofErr w:type="spellStart"/>
+      <w:r>
+        <w:t>tiết</w:t>
+      </w:r>
+      <w:proofErr w:type="spellEnd"/>
+      <w:r>
+        <w:t xml:space="preserve"> </w:t>
+      </w:r>
+      <w:proofErr w:type="spellStart"/>
+      <w:r>
+        <w:t>đơn</w:t>
+      </w:r>
+      <w:proofErr w:type="spellEnd"/>
+      <w:r>
+        <w:t xml:space="preserve"> </w:t>
+      </w:r>
+      <w:proofErr w:type="spellStart"/>
+      <w:r>
+        <w:t>hàng</w:t>
+      </w:r>
+      <w:proofErr w:type="spellEnd"/>
+      <w:r>
+        <w:t xml:space="preserve">; </w:t>
+      </w:r>
+      <w:proofErr w:type="spellStart"/>
+      <w:r>
+        <w:t>mỗi</w:t>
+      </w:r>
+      <w:proofErr w:type="spellEnd"/>
+      <w:r>
+        <w:t xml:space="preserve"> chi </w:t>
+      </w:r>
+      <w:proofErr w:type="spellStart"/>
+      <w:r>
+        <w:t>tiết</w:t>
+      </w:r>
+      <w:proofErr w:type="spellEnd"/>
+      <w:r>
+        <w:t xml:space="preserve"> </w:t>
+      </w:r>
+      <w:proofErr w:type="spellStart"/>
+      <w:r>
+        <w:t>thuộc</w:t>
+      </w:r>
+      <w:proofErr w:type="spellEnd"/>
+      <w:r>
+        <w:t xml:space="preserve"> </w:t>
+      </w:r>
+      <w:proofErr w:type="spellStart"/>
+      <w:r>
+        <w:t>về</w:t>
+      </w:r>
+      <w:proofErr w:type="spellEnd"/>
+      <w:r>
+        <w:t xml:space="preserve"> </w:t>
+      </w:r>
+      <w:proofErr w:type="spellStart"/>
+      <w:r>
+        <w:t>một</w:t>
+      </w:r>
+      <w:proofErr w:type="spellEnd"/>
+      <w:r>
+        <w:t xml:space="preserve"> </w:t>
+      </w:r>
+      <w:proofErr w:type="spellStart"/>
+      <w:r>
+        <w:t>đơn</w:t>
+      </w:r>
+      <w:proofErr w:type="spellEnd"/>
+      <w:r>
+        <w:t xml:space="preserve"> </w:t>
+      </w:r>
+      <w:proofErr w:type="spellStart"/>
+      <w:r>
+        <w:t>hàng</w:t>
+      </w:r>
+      <w:proofErr w:type="spellEnd"/>
+      <w:r>
+        <w:t>. </w:t>
+      </w:r>
+      <w:r>
+        <w:rPr>
+          <w:b/>
+          <w:bCs/>
+        </w:rPr>
+        <w:t>(</w:t>
+      </w:r>
+      <w:proofErr w:type="gramStart"/>
+      <w:r>
+        <w:rPr>
+          <w:b/>
+          <w:bCs/>
+        </w:rPr>
+        <w:t>1:N</w:t>
+      </w:r>
+      <w:proofErr w:type="gramEnd"/>
+      <w:r>
+        <w:rPr>
+          <w:b/>
+          <w:bCs/>
+        </w:rPr>
+        <w:t>)</w:t>
+      </w:r>
+    </w:p>
+    <w:p>
+      <w:pPr>
+        <w:rPr>
+          <w:b/>
+          <w:bCs/>
+        </w:rPr>
+      </w:pPr>
+      <w:proofErr w:type="spellStart"/>
+      <w:r>
+        <w:rPr>
+          <w:b/>
+          <w:bCs/>
+        </w:rPr>
+        <w:t>ticket_type</w:t>
+      </w:r>
+      <w:proofErr w:type="spellEnd"/>
+      <w:r>
+        <w:rPr>
+          <w:b/>
+          <w:bCs/>
+        </w:rPr>
+        <w:t> – </w:t>
+      </w:r>
+      <w:proofErr w:type="spellStart"/>
+      <w:r>
+        <w:rPr>
+          <w:b/>
+          <w:bCs/>
+        </w:rPr>
+        <w:t>order_item</w:t>
+      </w:r>
+      <w:proofErr w:type="spellEnd"/>
+    </w:p>
+    <w:p>
+      <w:pPr>
+        <w:numPr>
+          <w:ilvl w:val="0"/>
+          <w:numId w:val="9"/>
+        </w:numPr>
+      </w:pPr>
+      <w:proofErr w:type="spellStart"/>
+      <w:r>
+        <w:t>Một</w:t>
+      </w:r>
+      <w:proofErr w:type="spellEnd"/>
+      <w:r>
+        <w:t xml:space="preserve"> </w:t>
+      </w:r>
+      <w:proofErr w:type="spellStart"/>
+      <w:r>
+        <w:t>loại</w:t>
+      </w:r>
+      <w:proofErr w:type="spellEnd"/>
+      <w:r>
+        <w:t xml:space="preserve"> </w:t>
+      </w:r>
+      <w:proofErr w:type="spellStart"/>
+      <w:r>
+        <w:t>vé</w:t>
+      </w:r>
+      <w:proofErr w:type="spellEnd"/>
+      <w:r>
+        <w:t xml:space="preserve"> </w:t>
+      </w:r>
+      <w:proofErr w:type="spellStart"/>
+      <w:r>
+        <w:t>có</w:t>
+      </w:r>
+      <w:proofErr w:type="spellEnd"/>
+      <w:r>
+        <w:t xml:space="preserve"> </w:t>
+      </w:r>
+      <w:proofErr w:type="spellStart"/>
+      <w:r>
+        <w:t>thể</w:t>
+      </w:r>
+      <w:proofErr w:type="spellEnd"/>
+      <w:r>
+        <w:t xml:space="preserve"> </w:t>
+      </w:r>
+      <w:proofErr w:type="spellStart"/>
+      <w:r>
+        <w:t>xuất</w:t>
+      </w:r>
+      <w:proofErr w:type="spellEnd"/>
+      <w:r>
+        <w:t xml:space="preserve"> </w:t>
+      </w:r>
+      <w:proofErr w:type="spellStart"/>
+      <w:r>
+        <w:t>hiện</w:t>
+      </w:r>
+      <w:proofErr w:type="spellEnd"/>
+      <w:r>
+        <w:t xml:space="preserve"> </w:t>
+      </w:r>
+      <w:proofErr w:type="spellStart"/>
+      <w:r>
+        <w:t>trong</w:t>
+      </w:r>
+      <w:proofErr w:type="spellEnd"/>
+      <w:r>
+        <w:t xml:space="preserve"> </w:t>
+      </w:r>
+      <w:proofErr w:type="spellStart"/>
+      <w:r>
+        <w:t>nhiều</w:t>
+      </w:r>
+      <w:proofErr w:type="spellEnd"/>
+      <w:r>
+        <w:t xml:space="preserve"> chi </w:t>
+      </w:r>
+      <w:proofErr w:type="spellStart"/>
+      <w:r>
+        <w:t>tiết</w:t>
+      </w:r>
+      <w:proofErr w:type="spellEnd"/>
+      <w:r>
+        <w:t xml:space="preserve"> </w:t>
+      </w:r>
+      <w:proofErr w:type="spellStart"/>
+      <w:r>
+        <w:t>đơn</w:t>
+      </w:r>
+      <w:proofErr w:type="spellEnd"/>
+      <w:r>
+        <w:t xml:space="preserve"> </w:t>
+      </w:r>
+      <w:proofErr w:type="spellStart"/>
+      <w:r>
+        <w:t>hàng</w:t>
+      </w:r>
+      <w:proofErr w:type="spellEnd"/>
+      <w:r>
+        <w:t xml:space="preserve">; </w:t>
+      </w:r>
+      <w:proofErr w:type="spellStart"/>
+      <w:r>
+        <w:t>mỗi</w:t>
+      </w:r>
+      <w:proofErr w:type="spellEnd"/>
+      <w:r>
+        <w:t xml:space="preserve"> chi </w:t>
+      </w:r>
+      <w:proofErr w:type="spellStart"/>
+      <w:r>
+        <w:t>tiết</w:t>
+      </w:r>
+      <w:proofErr w:type="spellEnd"/>
+      <w:r>
+        <w:t xml:space="preserve"> </w:t>
+      </w:r>
+      <w:proofErr w:type="spellStart"/>
+      <w:r>
+        <w:t>đơn</w:t>
+      </w:r>
+      <w:proofErr w:type="spellEnd"/>
+      <w:r>
+        <w:t xml:space="preserve"> </w:t>
+      </w:r>
+      <w:proofErr w:type="spellStart"/>
+      <w:r>
+        <w:t>hàng</w:t>
+      </w:r>
+      <w:proofErr w:type="spellEnd"/>
+      <w:r>
+        <w:t xml:space="preserve"> </w:t>
+      </w:r>
+      <w:proofErr w:type="spellStart"/>
+      <w:r>
+        <w:t>chọn</w:t>
+      </w:r>
+      <w:proofErr w:type="spellEnd"/>
+      <w:r>
+        <w:t xml:space="preserve"> </w:t>
+      </w:r>
+      <w:proofErr w:type="spellStart"/>
+      <w:r>
+        <w:t>một</w:t>
+      </w:r>
+      <w:proofErr w:type="spellEnd"/>
+      <w:r>
+        <w:t xml:space="preserve"> </w:t>
+      </w:r>
+      <w:proofErr w:type="spellStart"/>
+      <w:r>
+        <w:t>loại</w:t>
+      </w:r>
+      <w:proofErr w:type="spellEnd"/>
+      <w:r>
+        <w:t xml:space="preserve"> </w:t>
+      </w:r>
+      <w:proofErr w:type="spellStart"/>
+      <w:r>
+        <w:t>vé</w:t>
+      </w:r>
+      <w:proofErr w:type="spellEnd"/>
+      <w:r>
+        <w:t>. </w:t>
+      </w:r>
+      <w:r>
+        <w:rPr>
+          <w:b/>
+          <w:bCs/>
+        </w:rPr>
+        <w:t>(</w:t>
+      </w:r>
+      <w:proofErr w:type="gramStart"/>
+      <w:r>
+        <w:rPr>
+          <w:b/>
+          <w:bCs/>
+        </w:rPr>
+        <w:t>1:N</w:t>
+      </w:r>
+      <w:proofErr w:type="gramEnd"/>
+      <w:r>
+        <w:rPr>
+          <w:b/>
+          <w:bCs/>
+        </w:rPr>
+        <w:t>)</w:t>
+      </w:r>
+    </w:p>
+    <w:p>
+      <w:pPr>
+        <w:rPr>
+          <w:b/>
+          <w:bCs/>
+        </w:rPr>
+      </w:pPr>
+      <w:proofErr w:type="spellStart"/>
+      <w:r>
+        <w:rPr>
+          <w:b/>
+          <w:bCs/>
+        </w:rPr>
+        <w:t>ticket_order</w:t>
+      </w:r>
+      <w:proofErr w:type="spellEnd"/>
+      <w:r>
+        <w:rPr>
+          <w:b/>
+          <w:bCs/>
+        </w:rPr>
+        <w:t> – payment</w:t>
+      </w:r>
+    </w:p>
+    <w:p>
+      <w:pPr>
+        <w:numPr>
+          <w:ilvl w:val="0"/>
+          <w:numId w:val="10"/>
+        </w:numPr>
+      </w:pPr>
+      <w:proofErr w:type="spellStart"/>
+      <w:r>
+        <w:t>Một</w:t>
+      </w:r>
+      <w:proofErr w:type="spellEnd"/>
+      <w:r>
+        <w:t xml:space="preserve"> </w:t>
+      </w:r>
+      <w:proofErr w:type="spellStart"/>
+      <w:r>
+        <w:t>đơn</w:t>
+      </w:r>
+      <w:proofErr w:type="spellEnd"/>
+      <w:r>
+        <w:t xml:space="preserve"> </w:t>
+      </w:r>
+      <w:proofErr w:type="spellStart"/>
+      <w:r>
+        <w:t>hàng</w:t>
+      </w:r>
+      <w:proofErr w:type="spellEnd"/>
+      <w:r>
+        <w:t xml:space="preserve"> </w:t>
+      </w:r>
+      <w:proofErr w:type="spellStart"/>
+      <w:r>
+        <w:t>có</w:t>
+      </w:r>
+      <w:proofErr w:type="spellEnd"/>
+      <w:r>
+        <w:t xml:space="preserve"> </w:t>
+      </w:r>
+      <w:proofErr w:type="spellStart"/>
+      <w:r>
+        <w:t>thể</w:t>
+      </w:r>
+      <w:proofErr w:type="spellEnd"/>
+      <w:r>
+        <w:t xml:space="preserve"> </w:t>
+      </w:r>
+      <w:proofErr w:type="spellStart"/>
+      <w:r>
+        <w:t>có</w:t>
+      </w:r>
+      <w:proofErr w:type="spellEnd"/>
+      <w:r>
+        <w:t xml:space="preserve"> </w:t>
+      </w:r>
+      <w:proofErr w:type="spellStart"/>
+      <w:r>
+        <w:t>nhiều</w:t>
+      </w:r>
+      <w:proofErr w:type="spellEnd"/>
+      <w:r>
+        <w:t xml:space="preserve"> </w:t>
+      </w:r>
+      <w:proofErr w:type="spellStart"/>
+      <w:r>
+        <w:t>giao</w:t>
+      </w:r>
+      <w:proofErr w:type="spellEnd"/>
+      <w:r>
+        <w:t xml:space="preserve"> </w:t>
+      </w:r>
+      <w:proofErr w:type="spellStart"/>
+      <w:r>
+        <w:t>dịch</w:t>
+      </w:r>
+      <w:proofErr w:type="spellEnd"/>
+      <w:r>
+        <w:t xml:space="preserve"> thanh </w:t>
+      </w:r>
+      <w:proofErr w:type="spellStart"/>
+      <w:r>
+        <w:t>toán</w:t>
+      </w:r>
+      <w:proofErr w:type="spellEnd"/>
+      <w:r>
+        <w:t xml:space="preserve">; </w:t>
+      </w:r>
+      <w:proofErr w:type="spellStart"/>
+      <w:r>
+        <w:t>mỗi</w:t>
+      </w:r>
+      <w:proofErr w:type="spellEnd"/>
+      <w:r>
+        <w:t xml:space="preserve"> </w:t>
+      </w:r>
+      <w:proofErr w:type="spellStart"/>
+      <w:r>
+        <w:t>giao</w:t>
+      </w:r>
+      <w:proofErr w:type="spellEnd"/>
+      <w:r>
+        <w:t xml:space="preserve"> </w:t>
+      </w:r>
+      <w:proofErr w:type="spellStart"/>
+      <w:r>
+        <w:t>dịch</w:t>
+      </w:r>
+      <w:proofErr w:type="spellEnd"/>
+      <w:r>
+        <w:t xml:space="preserve"> </w:t>
+      </w:r>
+      <w:proofErr w:type="spellStart"/>
+      <w:r>
+        <w:t>thuộc</w:t>
+      </w:r>
+      <w:proofErr w:type="spellEnd"/>
+      <w:r>
+        <w:t xml:space="preserve"> </w:t>
+      </w:r>
+      <w:proofErr w:type="spellStart"/>
+      <w:r>
+        <w:t>về</w:t>
+      </w:r>
+      <w:proofErr w:type="spellEnd"/>
+      <w:r>
+        <w:t xml:space="preserve"> </w:t>
+      </w:r>
+      <w:proofErr w:type="spellStart"/>
+      <w:r>
+        <w:t>một</w:t>
+      </w:r>
+      <w:proofErr w:type="spellEnd"/>
+      <w:r>
+        <w:t xml:space="preserve"> </w:t>
+      </w:r>
+      <w:proofErr w:type="spellStart"/>
+      <w:r>
+        <w:t>đơn</w:t>
+      </w:r>
+      <w:proofErr w:type="spellEnd"/>
+      <w:r>
+        <w:t xml:space="preserve"> </w:t>
+      </w:r>
+      <w:proofErr w:type="spellStart"/>
+      <w:r>
+        <w:t>hàng</w:t>
+      </w:r>
+      <w:proofErr w:type="spellEnd"/>
+      <w:r>
+        <w:t>. </w:t>
+      </w:r>
+      <w:r>
+        <w:rPr>
+          <w:b/>
+          <w:bCs/>
+        </w:rPr>
+        <w:t>(</w:t>
+      </w:r>
+      <w:proofErr w:type="gramStart"/>
+      <w:r>
+        <w:rPr>
+          <w:b/>
+          <w:bCs/>
+        </w:rPr>
+        <w:t>1:N</w:t>
+      </w:r>
+      <w:proofErr w:type="gramEnd"/>
+      <w:r>
+        <w:rPr>
+          <w:b/>
+          <w:bCs/>
+        </w:rPr>
+        <w:t>)</w:t>
+      </w:r>
+    </w:p>
+    <w:p>
+      <w:pPr>
+        <w:rPr>
+          <w:b/>
+          <w:bCs/>
+        </w:rPr>
+      </w:pPr>
+      <w:proofErr w:type="spellStart"/>
+      <w:r>
+        <w:rPr>
+          <w:b/>
+          <w:bCs/>
+        </w:rPr>
+        <w:t>order_item</w:t>
+      </w:r>
+      <w:proofErr w:type="spellEnd"/>
+      <w:r>
+        <w:rPr>
+          <w:b/>
+          <w:bCs/>
+        </w:rPr>
+        <w:t> – ticket</w:t>
+      </w:r>
+    </w:p>
+    <w:p>
+      <w:pPr>
+        <w:numPr>
+          <w:ilvl w:val="0"/>
+          <w:numId w:val="11"/>
+        </w:numPr>
+      </w:pPr>
+      <w:proofErr w:type="spellStart"/>
+      <w:r>
+        <w:t>Một</w:t>
+      </w:r>
+      <w:proofErr w:type="spellEnd"/>
+      <w:r>
+        <w:t xml:space="preserve"> chi </w:t>
+      </w:r>
+      <w:proofErr w:type="spellStart"/>
+      <w:r>
+        <w:t>tiết</w:t>
+      </w:r>
+      <w:proofErr w:type="spellEnd"/>
+      <w:r>
+        <w:t xml:space="preserve"> </w:t>
+      </w:r>
+      <w:proofErr w:type="spellStart"/>
+      <w:r>
+        <w:t>đơn</w:t>
+      </w:r>
+      <w:proofErr w:type="spellEnd"/>
+      <w:r>
+        <w:t xml:space="preserve"> </w:t>
+      </w:r>
+      <w:proofErr w:type="spellStart"/>
+      <w:r>
+        <w:t>hàng</w:t>
+      </w:r>
+      <w:proofErr w:type="spellEnd"/>
+      <w:r>
+        <w:t xml:space="preserve"> </w:t>
+      </w:r>
+      <w:proofErr w:type="spellStart"/>
+      <w:r>
+        <w:t>có</w:t>
+      </w:r>
+      <w:proofErr w:type="spellEnd"/>
+      <w:r>
+        <w:t xml:space="preserve"> </w:t>
+      </w:r>
+      <w:proofErr w:type="spellStart"/>
+      <w:r>
+        <w:t>thể</w:t>
+      </w:r>
+      <w:proofErr w:type="spellEnd"/>
+      <w:r>
+        <w:t xml:space="preserve"> </w:t>
+      </w:r>
+      <w:proofErr w:type="spellStart"/>
+      <w:r>
+        <w:t>tạo</w:t>
+      </w:r>
+      <w:proofErr w:type="spellEnd"/>
+      <w:r>
+        <w:t xml:space="preserve"> </w:t>
+      </w:r>
+      <w:proofErr w:type="spellStart"/>
+      <w:r>
+        <w:t>ra</w:t>
+      </w:r>
+      <w:proofErr w:type="spellEnd"/>
+      <w:r>
+        <w:t xml:space="preserve"> </w:t>
+      </w:r>
+      <w:proofErr w:type="spellStart"/>
+      <w:r>
+        <w:t>nhiều</w:t>
+      </w:r>
+      <w:proofErr w:type="spellEnd"/>
+      <w:r>
+        <w:t xml:space="preserve"> </w:t>
+      </w:r>
+      <w:proofErr w:type="spellStart"/>
+      <w:r>
+        <w:t>vé</w:t>
+      </w:r>
+      <w:proofErr w:type="spellEnd"/>
+      <w:r>
+        <w:t xml:space="preserve"> riêng </w:t>
+      </w:r>
+      <w:proofErr w:type="spellStart"/>
+      <w:r>
+        <w:t>lẻ</w:t>
+      </w:r>
+      <w:proofErr w:type="spellEnd"/>
+      <w:r>
+        <w:t xml:space="preserve">; </w:t>
+      </w:r>
+      <w:proofErr w:type="spellStart"/>
+      <w:r>
+        <w:t>mỗi</w:t>
+      </w:r>
+      <w:proofErr w:type="spellEnd"/>
+      <w:r>
+        <w:t xml:space="preserve"> </w:t>
+      </w:r>
+      <w:proofErr w:type="spellStart"/>
+      <w:r>
+        <w:t>vé</w:t>
+      </w:r>
+      <w:proofErr w:type="spellEnd"/>
+      <w:r>
+        <w:t xml:space="preserve"> được </w:t>
+      </w:r>
+      <w:proofErr w:type="spellStart"/>
+      <w:r>
+        <w:t>tạo</w:t>
+      </w:r>
+      <w:proofErr w:type="spellEnd"/>
+      <w:r>
+        <w:t xml:space="preserve"> </w:t>
+      </w:r>
+      <w:proofErr w:type="spellStart"/>
+      <w:r>
+        <w:t>từ</w:t>
+      </w:r>
+      <w:proofErr w:type="spellEnd"/>
+      <w:r>
+        <w:t xml:space="preserve"> </w:t>
+      </w:r>
+      <w:proofErr w:type="spellStart"/>
+      <w:r>
+        <w:t>một</w:t>
+      </w:r>
+      <w:proofErr w:type="spellEnd"/>
+      <w:r>
+        <w:t xml:space="preserve"> chi </w:t>
+      </w:r>
+      <w:proofErr w:type="spellStart"/>
+      <w:r>
+        <w:t>tiết</w:t>
+      </w:r>
+      <w:proofErr w:type="spellEnd"/>
+      <w:r>
+        <w:t xml:space="preserve"> </w:t>
+      </w:r>
+      <w:proofErr w:type="spellStart"/>
+      <w:r>
+        <w:t>đơn</w:t>
+      </w:r>
+      <w:proofErr w:type="spellEnd"/>
+      <w:r>
+        <w:t xml:space="preserve"> </w:t>
+      </w:r>
+      <w:proofErr w:type="spellStart"/>
+      <w:r>
+        <w:t>hàng</w:t>
+      </w:r>
+      <w:proofErr w:type="spellEnd"/>
+      <w:r>
+        <w:t>. </w:t>
+      </w:r>
+      <w:r>
+        <w:rPr>
+          <w:b/>
+          <w:bCs/>
+        </w:rPr>
+        <w:t>(</w:t>
+      </w:r>
+      <w:proofErr w:type="gramStart"/>
+      <w:r>
+        <w:rPr>
+          <w:b/>
+          <w:bCs/>
+        </w:rPr>
+        <w:t>1:N</w:t>
+      </w:r>
+      <w:proofErr w:type="gramEnd"/>
+      <w:r>
+        <w:rPr>
+          <w:b/>
+          <w:bCs/>
+        </w:rPr>
+        <w:t>)</w:t>
+      </w:r>
+    </w:p>
+    <w:p>
+      <w:r>
+        <w:rPr>
+          <w:b/>
+          <w:bCs/>
+        </w:rPr>
+        <w:t xml:space="preserve">Ghi </w:t>
+      </w:r>
+      <w:proofErr w:type="spellStart"/>
+      <w:r>
+        <w:rPr>
+          <w:b/>
+          <w:bCs/>
+        </w:rPr>
+        <w:t>chú</w:t>
+      </w:r>
+      <w:proofErr w:type="spellEnd"/>
+      <w:r>
+        <w:rPr>
+          <w:b/>
+          <w:bCs/>
+        </w:rPr>
+        <w:t>:</w:t>
+      </w:r>
+      <w:r>
+        <w:t> customer </w:t>
+      </w:r>
+      <w:proofErr w:type="spellStart"/>
+      <w:r>
+        <w:t>liên</w:t>
+      </w:r>
+      <w:proofErr w:type="spellEnd"/>
+      <w:r>
+        <w:t xml:space="preserve"> </w:t>
+      </w:r>
+      <w:proofErr w:type="spellStart"/>
+      <w:r>
+        <w:t>kết</w:t>
+      </w:r>
+      <w:proofErr w:type="spellEnd"/>
+      <w:r>
+        <w:t xml:space="preserve"> </w:t>
+      </w:r>
+      <w:proofErr w:type="spellStart"/>
+      <w:r>
+        <w:t>với</w:t>
+      </w:r>
+      <w:proofErr w:type="spellEnd"/>
+      <w:r>
+        <w:t> payment </w:t>
+      </w:r>
+      <w:proofErr w:type="spellStart"/>
+      <w:r>
+        <w:t>thông</w:t>
+      </w:r>
+      <w:proofErr w:type="spellEnd"/>
+      <w:r>
+        <w:t xml:space="preserve"> qua </w:t>
+      </w:r>
+      <w:proofErr w:type="spellStart"/>
+      <w:r>
+        <w:t>ticket_order</w:t>
+      </w:r>
+      <w:proofErr w:type="spellEnd"/>
+      <w:r>
+        <w:t xml:space="preserve">; database </w:t>
+      </w:r>
+      <w:proofErr w:type="spellStart"/>
+      <w:r>
+        <w:t>hiện</w:t>
+      </w:r>
+      <w:proofErr w:type="spellEnd"/>
+      <w:r>
+        <w:t xml:space="preserve"> </w:t>
+      </w:r>
+      <w:proofErr w:type="spellStart"/>
+      <w:r>
+        <w:t>không</w:t>
+      </w:r>
+      <w:proofErr w:type="spellEnd"/>
+      <w:r>
+        <w:t xml:space="preserve"> </w:t>
+      </w:r>
+      <w:proofErr w:type="spellStart"/>
+      <w:r>
+        <w:t>có</w:t>
+      </w:r>
+      <w:proofErr w:type="spellEnd"/>
+      <w:r>
+        <w:t xml:space="preserve"> </w:t>
+      </w:r>
+      <w:proofErr w:type="spellStart"/>
+      <w:r>
+        <w:t>quan</w:t>
+      </w:r>
+      <w:proofErr w:type="spellEnd"/>
+      <w:r>
+        <w:t xml:space="preserve"> </w:t>
+      </w:r>
+      <w:proofErr w:type="spellStart"/>
+      <w:r>
+        <w:t>hệ</w:t>
+      </w:r>
+      <w:proofErr w:type="spellEnd"/>
+      <w:r>
+        <w:t xml:space="preserve"> </w:t>
+      </w:r>
+      <w:proofErr w:type="spellStart"/>
+      <w:r>
+        <w:t>trực</w:t>
+      </w:r>
+      <w:proofErr w:type="spellEnd"/>
+      <w:r>
+        <w:t xml:space="preserve"> tiếp </w:t>
+      </w:r>
+      <w:proofErr w:type="spellStart"/>
+      <w:r>
+        <w:t>giữa</w:t>
+      </w:r>
+      <w:proofErr w:type="spellEnd"/>
+      <w:r>
+        <w:t xml:space="preserve"> </w:t>
+      </w:r>
+      <w:proofErr w:type="spellStart"/>
+      <w:r>
+        <w:t>hai</w:t>
+      </w:r>
+      <w:proofErr w:type="spellEnd"/>
+      <w:r>
+        <w:t xml:space="preserve"> </w:t>
+      </w:r>
+      <w:proofErr w:type="spellStart"/>
+      <w:r>
+        <w:t>bảng</w:t>
+      </w:r>
+      <w:proofErr w:type="spellEnd"/>
+      <w:r>
+        <w:t xml:space="preserve"> </w:t>
+      </w:r>
+      <w:proofErr w:type="spellStart"/>
+      <w:r>
+        <w:t>này</w:t>
+      </w:r>
+      <w:proofErr w:type="spellEnd"/>
+      <w:r>
+        <w:t>.</w:t>
+      </w:r>
+    </w:p>
     <w:p>
       <w:pPr>
         <w:rPr>
@@ -50,8 +1763,62 @@
       <w:proofErr w:type="spellEnd"/>
     </w:p>
     <w:p>
-      <w:r>
-        <w:t>Purpose: Stores event categories.</w:t>
+      <w:proofErr w:type="spellStart"/>
+      <w:r>
+        <w:lastRenderedPageBreak/>
+        <w:t>Dùng</w:t>
+      </w:r>
+      <w:proofErr w:type="spellEnd"/>
+      <w:r>
+        <w:t xml:space="preserve"> </w:t>
+      </w:r>
+      <w:proofErr w:type="spellStart"/>
+      <w:r>
+        <w:t>để</w:t>
+      </w:r>
+      <w:proofErr w:type="spellEnd"/>
+      <w:r>
+        <w:t xml:space="preserve"> </w:t>
+      </w:r>
+      <w:proofErr w:type="spellStart"/>
+      <w:r>
+        <w:t>phân</w:t>
+      </w:r>
+      <w:proofErr w:type="spellEnd"/>
+      <w:r>
+        <w:t xml:space="preserve"> </w:t>
+      </w:r>
+      <w:proofErr w:type="spellStart"/>
+      <w:r>
+        <w:t>loại</w:t>
+      </w:r>
+      <w:proofErr w:type="spellEnd"/>
+      <w:r>
+        <w:t xml:space="preserve"> sự </w:t>
+      </w:r>
+      <w:proofErr w:type="spellStart"/>
+      <w:r>
+        <w:t>kiện</w:t>
+      </w:r>
+      <w:proofErr w:type="spellEnd"/>
+      <w:r>
+        <w:t xml:space="preserve">, </w:t>
+      </w:r>
+      <w:proofErr w:type="spellStart"/>
+      <w:r>
+        <w:t>ví</w:t>
+      </w:r>
+      <w:proofErr w:type="spellEnd"/>
+      <w:r>
+        <w:t xml:space="preserve"> </w:t>
+      </w:r>
+      <w:proofErr w:type="spellStart"/>
+      <w:r>
+        <w:t>dụ</w:t>
+      </w:r>
+      <w:proofErr w:type="spellEnd"/>
+      <w:r>
+        <w:t>: Music, Sports, Conference, Festival.</w:t>
       </w:r>
     </w:p>
     <w:tbl>
@@ -419,7 +2186,79 @@
     </w:p>
     <w:p>
       <w:r>
-        <w:t>Purpose: Stores event venues.</w:t>
+        <w:t xml:space="preserve">Lưu </w:t>
+      </w:r>
+      <w:proofErr w:type="spellStart"/>
+      <w:r>
+        <w:t>thông</w:t>
+      </w:r>
+      <w:proofErr w:type="spellEnd"/>
+      <w:r>
+        <w:t xml:space="preserve"> tin </w:t>
+      </w:r>
+      <w:proofErr w:type="spellStart"/>
+      <w:r>
+        <w:t>địa</w:t>
+      </w:r>
+      <w:proofErr w:type="spellEnd"/>
+      <w:r>
+        <w:t xml:space="preserve"> </w:t>
+      </w:r>
+      <w:proofErr w:type="spellStart"/>
+      <w:r>
+        <w:t>điểm</w:t>
+      </w:r>
+      <w:proofErr w:type="spellEnd"/>
+      <w:r>
+        <w:t xml:space="preserve"> </w:t>
+      </w:r>
+      <w:proofErr w:type="spellStart"/>
+      <w:r>
+        <w:t>như</w:t>
+      </w:r>
+      <w:proofErr w:type="spellEnd"/>
+      <w:r>
+        <w:t xml:space="preserve"> SECC, </w:t>
+      </w:r>
+      <w:proofErr w:type="spellStart"/>
+      <w:r>
+        <w:t>sân</w:t>
+      </w:r>
+      <w:proofErr w:type="spellEnd"/>
+      <w:r>
+        <w:t xml:space="preserve"> </w:t>
+      </w:r>
+      <w:proofErr w:type="spellStart"/>
+      <w:r>
+        <w:t>vận</w:t>
+      </w:r>
+      <w:proofErr w:type="spellEnd"/>
+      <w:r>
+        <w:t xml:space="preserve"> </w:t>
+      </w:r>
+      <w:proofErr w:type="spellStart"/>
+      <w:r>
+        <w:t>động</w:t>
+      </w:r>
+      <w:proofErr w:type="spellEnd"/>
+      <w:r>
+        <w:t xml:space="preserve">, </w:t>
+      </w:r>
+      <w:proofErr w:type="spellStart"/>
+      <w:r>
+        <w:t>nhà</w:t>
+      </w:r>
+      <w:proofErr w:type="spellEnd"/>
+      <w:r>
+        <w:t xml:space="preserve"> </w:t>
+      </w:r>
+      <w:proofErr w:type="spellStart"/>
+      <w:r>
+        <w:t>hát</w:t>
+      </w:r>
+      <w:proofErr w:type="spellEnd"/>
+      <w:r>
+        <w:t>.</w:t>
       </w:r>
     </w:p>
     <w:tbl>
@@ -834,7 +2673,103 @@
     </w:p>
     <w:p>
       <w:r>
-        <w:t>Purpose: Stores event information and schedules.</w:t>
+        <w:t xml:space="preserve">Lưu sự </w:t>
+      </w:r>
+      <w:proofErr w:type="spellStart"/>
+      <w:r>
+        <w:t>kiện</w:t>
+      </w:r>
+      <w:proofErr w:type="spellEnd"/>
+      <w:r>
+        <w:t xml:space="preserve"> </w:t>
+      </w:r>
+      <w:proofErr w:type="spellStart"/>
+      <w:r>
+        <w:t>cụ</w:t>
+      </w:r>
+      <w:proofErr w:type="spellEnd"/>
+      <w:r>
+        <w:t xml:space="preserve"> </w:t>
+      </w:r>
+      <w:proofErr w:type="spellStart"/>
+      <w:r>
+        <w:t>thể</w:t>
+      </w:r>
+      <w:proofErr w:type="spellEnd"/>
+      <w:r>
+        <w:t xml:space="preserve">, </w:t>
+      </w:r>
+      <w:proofErr w:type="spellStart"/>
+      <w:r>
+        <w:t>gồm</w:t>
+      </w:r>
+      <w:proofErr w:type="spellEnd"/>
+      <w:r>
+        <w:t xml:space="preserve"> </w:t>
+      </w:r>
+      <w:proofErr w:type="spellStart"/>
+      <w:r>
+        <w:t>tên</w:t>
+      </w:r>
+      <w:proofErr w:type="spellEnd"/>
+      <w:r>
+        <w:t xml:space="preserve">, </w:t>
+      </w:r>
+      <w:proofErr w:type="spellStart"/>
+      <w:r>
+        <w:t>thời</w:t>
+      </w:r>
+      <w:proofErr w:type="spellEnd"/>
+      <w:r>
+        <w:t xml:space="preserve"> </w:t>
+      </w:r>
+      <w:proofErr w:type="spellStart"/>
+      <w:r>
+        <w:t>gian</w:t>
+      </w:r>
+      <w:proofErr w:type="spellEnd"/>
+      <w:r>
+        <w:t xml:space="preserve">, </w:t>
+      </w:r>
+      <w:proofErr w:type="spellStart"/>
+      <w:r>
+        <w:t>địa</w:t>
+      </w:r>
+      <w:proofErr w:type="spellEnd"/>
+      <w:r>
+        <w:t xml:space="preserve"> </w:t>
+      </w:r>
+      <w:proofErr w:type="spellStart"/>
+      <w:r>
+        <w:t>điểm</w:t>
+      </w:r>
+      <w:proofErr w:type="spellEnd"/>
+      <w:r>
+        <w:t xml:space="preserve">, </w:t>
+      </w:r>
+      <w:proofErr w:type="spellStart"/>
+      <w:r>
+        <w:t>danh</w:t>
+      </w:r>
+      <w:proofErr w:type="spellEnd"/>
+      <w:r>
+        <w:t xml:space="preserve"> </w:t>
+      </w:r>
+      <w:proofErr w:type="spellStart"/>
+      <w:r>
+        <w:t>mục</w:t>
+      </w:r>
+      <w:proofErr w:type="spellEnd"/>
+      <w:r>
+        <w:t xml:space="preserve"> và </w:t>
+      </w:r>
+      <w:proofErr w:type="spellStart"/>
+      <w:r>
+        <w:t>trạng</w:t>
+      </w:r>
+      <w:proofErr w:type="spellEnd"/>
+      <w:r>
+        <w:t xml:space="preserve"> thái.</w:t>
       </w:r>
     </w:p>
     <w:tbl>
@@ -1485,7 +3420,6 @@
             </w:pPr>
             <w:proofErr w:type="spellStart"/>
             <w:r>
-              <w:lastRenderedPageBreak/>
               <w:t>event_status</w:t>
             </w:r>
             <w:proofErr w:type="spellEnd"/>
@@ -1557,7 +3491,39 @@
     </w:p>
     <w:p>
       <w:r>
-        <w:t>Purpose: Stores customer information.</w:t>
+        <w:t xml:space="preserve">Lưu </w:t>
+      </w:r>
+      <w:proofErr w:type="spellStart"/>
+      <w:r>
+        <w:t>thông</w:t>
+      </w:r>
+      <w:proofErr w:type="spellEnd"/>
+      <w:r>
+        <w:t xml:space="preserve"> tin </w:t>
+      </w:r>
+      <w:proofErr w:type="spellStart"/>
+      <w:r>
+        <w:t>người</w:t>
+      </w:r>
+      <w:proofErr w:type="spellEnd"/>
+      <w:r>
+        <w:t xml:space="preserve"> </w:t>
+      </w:r>
+      <w:proofErr w:type="spellStart"/>
+      <w:r>
+        <w:t>mua</w:t>
+      </w:r>
+      <w:proofErr w:type="spellEnd"/>
+      <w:r>
+        <w:t xml:space="preserve"> </w:t>
+      </w:r>
+      <w:proofErr w:type="spellStart"/>
+      <w:r>
+        <w:t>vé</w:t>
+      </w:r>
+      <w:proofErr w:type="spellEnd"/>
+      <w:r>
+        <w:t>.</w:t>
       </w:r>
     </w:p>
     <w:tbl>
@@ -2066,8 +4032,85 @@
       <w:proofErr w:type="spellEnd"/>
     </w:p>
     <w:p>
-      <w:r>
-        <w:t>Purpose: Stores ticket categories, prices and issue limits.</w:t>
+      <w:proofErr w:type="spellStart"/>
+      <w:r>
+        <w:t>Mỗi</w:t>
+      </w:r>
+      <w:proofErr w:type="spellEnd"/>
+      <w:r>
+        <w:t xml:space="preserve"> sự </w:t>
+      </w:r>
+      <w:proofErr w:type="spellStart"/>
+      <w:r>
+        <w:t>kiện</w:t>
+      </w:r>
+      <w:proofErr w:type="spellEnd"/>
+      <w:r>
+        <w:t xml:space="preserve"> </w:t>
+      </w:r>
+      <w:proofErr w:type="spellStart"/>
+      <w:r>
+        <w:t>có</w:t>
+      </w:r>
+      <w:proofErr w:type="spellEnd"/>
+      <w:r>
+        <w:t xml:space="preserve"> </w:t>
+      </w:r>
+      <w:proofErr w:type="spellStart"/>
+      <w:r>
+        <w:t>thể</w:t>
+      </w:r>
+      <w:proofErr w:type="spellEnd"/>
+      <w:r>
+        <w:t xml:space="preserve"> </w:t>
+      </w:r>
+      <w:proofErr w:type="spellStart"/>
+      <w:r>
+        <w:t>bán</w:t>
+      </w:r>
+      <w:proofErr w:type="spellEnd"/>
+      <w:r>
+        <w:t xml:space="preserve"> </w:t>
+      </w:r>
+      <w:proofErr w:type="spellStart"/>
+      <w:r>
+        <w:t>nhiều</w:t>
+      </w:r>
+      <w:proofErr w:type="spellEnd"/>
+      <w:r>
+        <w:t xml:space="preserve"> </w:t>
+      </w:r>
+      <w:proofErr w:type="spellStart"/>
+      <w:r>
+        <w:t>loại</w:t>
+      </w:r>
+      <w:proofErr w:type="spellEnd"/>
+      <w:r>
+        <w:t xml:space="preserve"> </w:t>
+      </w:r>
+      <w:proofErr w:type="spellStart"/>
+      <w:r>
+        <w:t>vé</w:t>
+      </w:r>
+      <w:proofErr w:type="spellEnd"/>
+      <w:r>
+        <w:t xml:space="preserve">, </w:t>
+      </w:r>
+      <w:proofErr w:type="spellStart"/>
+      <w:r>
+        <w:t>ví</w:t>
+      </w:r>
+      <w:proofErr w:type="spellEnd"/>
+      <w:r>
+        <w:t xml:space="preserve"> </w:t>
+      </w:r>
+      <w:proofErr w:type="spellStart"/>
+      <w:r>
+        <w:t>dụ</w:t>
+      </w:r>
+      <w:proofErr w:type="spellEnd"/>
+      <w:r>
+        <w:t xml:space="preserve"> Standard và VIP.</w:t>
       </w:r>
     </w:p>
     <w:tbl>
@@ -2802,8 +4845,88 @@
       <w:proofErr w:type="spellEnd"/>
     </w:p>
     <w:p>
-      <w:r>
-        <w:t>Purpose: Stores ticket orders.</w:t>
+      <w:proofErr w:type="spellStart"/>
+      <w:r>
+        <w:t>Đại</w:t>
+      </w:r>
+      <w:proofErr w:type="spellEnd"/>
+      <w:r>
+        <w:t xml:space="preserve"> </w:t>
+      </w:r>
+      <w:proofErr w:type="spellStart"/>
+      <w:r>
+        <w:t>diện</w:t>
+      </w:r>
+      <w:proofErr w:type="spellEnd"/>
+      <w:r>
+        <w:t xml:space="preserve"> </w:t>
+      </w:r>
+      <w:proofErr w:type="spellStart"/>
+      <w:r>
+        <w:t>cho</w:t>
+      </w:r>
+      <w:proofErr w:type="spellEnd"/>
+      <w:r>
+        <w:t xml:space="preserve"> </w:t>
+      </w:r>
+      <w:proofErr w:type="spellStart"/>
+      <w:r>
+        <w:t>một</w:t>
+      </w:r>
+      <w:proofErr w:type="spellEnd"/>
+      <w:r>
+        <w:t xml:space="preserve"> </w:t>
+      </w:r>
+      <w:proofErr w:type="spellStart"/>
+      <w:r>
+        <w:t>lần</w:t>
+      </w:r>
+      <w:proofErr w:type="spellEnd"/>
+      <w:r>
+        <w:t xml:space="preserve"> </w:t>
+      </w:r>
+      <w:proofErr w:type="spellStart"/>
+      <w:r>
+        <w:t>đặt</w:t>
+      </w:r>
+      <w:proofErr w:type="spellEnd"/>
+      <w:r>
+        <w:t xml:space="preserve"> </w:t>
+      </w:r>
+      <w:proofErr w:type="spellStart"/>
+      <w:r>
+        <w:t>vé</w:t>
+      </w:r>
+      <w:proofErr w:type="spellEnd"/>
+      <w:r>
+        <w:t xml:space="preserve"> </w:t>
+      </w:r>
+      <w:proofErr w:type="spellStart"/>
+      <w:r>
+        <w:t>của</w:t>
+      </w:r>
+      <w:proofErr w:type="spellEnd"/>
+      <w:r>
+        <w:t xml:space="preserve"> </w:t>
+      </w:r>
+      <w:proofErr w:type="spellStart"/>
+      <w:r>
+        <w:t>khách</w:t>
+      </w:r>
+      <w:proofErr w:type="spellEnd"/>
+      <w:r>
+        <w:t xml:space="preserve"> </w:t>
+      </w:r>
+      <w:proofErr w:type="spellStart"/>
+      <w:r>
+        <w:t>hàng</w:t>
+      </w:r>
+      <w:proofErr w:type="spellEnd"/>
+      <w:r>
+        <w:t>.</w:t>
+      </w:r>
+      <w:r>
+        <w:t xml:space="preserve"> (don hang)</w:t>
       </w:r>
     </w:p>
     <w:tbl>
@@ -3217,8 +5340,85 @@
       <w:proofErr w:type="spellEnd"/>
     </w:p>
     <w:p>
-      <w:r>
-        <w:t>Purpose: Stores ticket types and quantities in each order.</w:t>
+      <w:proofErr w:type="spellStart"/>
+      <w:r>
+        <w:t>Mỗi</w:t>
+      </w:r>
+      <w:proofErr w:type="spellEnd"/>
+      <w:r>
+        <w:t xml:space="preserve"> </w:t>
+      </w:r>
+      <w:proofErr w:type="spellStart"/>
+      <w:r>
+        <w:t>dòng</w:t>
+      </w:r>
+      <w:proofErr w:type="spellEnd"/>
+      <w:r>
+        <w:t xml:space="preserve"> ghi </w:t>
+      </w:r>
+      <w:proofErr w:type="spellStart"/>
+      <w:r>
+        <w:t>một</w:t>
+      </w:r>
+      <w:proofErr w:type="spellEnd"/>
+      <w:r>
+        <w:t xml:space="preserve"> </w:t>
+      </w:r>
+      <w:proofErr w:type="spellStart"/>
+      <w:r>
+        <w:t>loại</w:t>
+      </w:r>
+      <w:proofErr w:type="spellEnd"/>
+      <w:r>
+        <w:t xml:space="preserve"> </w:t>
+      </w:r>
+      <w:proofErr w:type="spellStart"/>
+      <w:r>
+        <w:t>vé</w:t>
+      </w:r>
+      <w:proofErr w:type="spellEnd"/>
+      <w:r>
+        <w:t xml:space="preserve"> được </w:t>
+      </w:r>
+      <w:proofErr w:type="spellStart"/>
+      <w:r>
+        <w:t>mua</w:t>
+      </w:r>
+      <w:proofErr w:type="spellEnd"/>
+      <w:r>
+        <w:t xml:space="preserve"> </w:t>
+      </w:r>
+      <w:proofErr w:type="spellStart"/>
+      <w:r>
+        <w:t>trong</w:t>
+      </w:r>
+      <w:proofErr w:type="spellEnd"/>
+      <w:r>
+        <w:t xml:space="preserve"> </w:t>
+      </w:r>
+      <w:proofErr w:type="spellStart"/>
+      <w:r>
+        <w:t>một</w:t>
+      </w:r>
+      <w:proofErr w:type="spellEnd"/>
+      <w:r>
+        <w:t xml:space="preserve"> </w:t>
+      </w:r>
+      <w:proofErr w:type="spellStart"/>
+      <w:r>
+        <w:t>đơn</w:t>
+      </w:r>
+      <w:proofErr w:type="spellEnd"/>
+      <w:r>
+        <w:t xml:space="preserve"> </w:t>
+      </w:r>
+      <w:proofErr w:type="spellStart"/>
+      <w:r>
+        <w:t>hàng</w:t>
+      </w:r>
+      <w:proofErr w:type="spellEnd"/>
+      <w:r>
+        <w:t>.</w:t>
       </w:r>
     </w:p>
     <w:tbl>
@@ -3878,7 +6078,79 @@
     </w:p>
     <w:p>
       <w:r>
-        <w:t>Purpose: Stores payment attempts and transaction results.</w:t>
+        <w:t xml:space="preserve">Lưu </w:t>
+      </w:r>
+      <w:proofErr w:type="spellStart"/>
+      <w:r>
+        <w:t>thông</w:t>
+      </w:r>
+      <w:proofErr w:type="spellEnd"/>
+      <w:r>
+        <w:t xml:space="preserve"> tin </w:t>
+      </w:r>
+      <w:proofErr w:type="spellStart"/>
+      <w:r>
+        <w:t>các</w:t>
+      </w:r>
+      <w:proofErr w:type="spellEnd"/>
+      <w:r>
+        <w:t xml:space="preserve"> </w:t>
+      </w:r>
+      <w:proofErr w:type="spellStart"/>
+      <w:r>
+        <w:t>giao</w:t>
+      </w:r>
+      <w:proofErr w:type="spellEnd"/>
+      <w:r>
+        <w:t xml:space="preserve"> </w:t>
+      </w:r>
+      <w:proofErr w:type="spellStart"/>
+      <w:r>
+        <w:t>dịch</w:t>
+      </w:r>
+      <w:proofErr w:type="spellEnd"/>
+      <w:r>
+        <w:t xml:space="preserve"> thanh </w:t>
+      </w:r>
+      <w:proofErr w:type="spellStart"/>
+      <w:r>
+        <w:t>toán</w:t>
+      </w:r>
+      <w:proofErr w:type="spellEnd"/>
+      <w:r>
+        <w:t xml:space="preserve"> </w:t>
+      </w:r>
+      <w:proofErr w:type="spellStart"/>
+      <w:r>
+        <w:t>liên</w:t>
+      </w:r>
+      <w:proofErr w:type="spellEnd"/>
+      <w:r>
+        <w:t xml:space="preserve"> </w:t>
+      </w:r>
+      <w:proofErr w:type="spellStart"/>
+      <w:r>
+        <w:t>quan</w:t>
+      </w:r>
+      <w:proofErr w:type="spellEnd"/>
+      <w:r>
+        <w:t xml:space="preserve"> đến </w:t>
+      </w:r>
+      <w:proofErr w:type="spellStart"/>
+      <w:r>
+        <w:t>đơn</w:t>
+      </w:r>
+      <w:proofErr w:type="spellEnd"/>
+      <w:r>
+        <w:t xml:space="preserve"> </w:t>
+      </w:r>
+      <w:proofErr w:type="spellStart"/>
+      <w:r>
+        <w:t>hàng</w:t>
+      </w:r>
+      <w:proofErr w:type="spellEnd"/>
+      <w:r>
+        <w:t>.</w:t>
       </w:r>
     </w:p>
     <w:tbl>
@@ -4564,7 +6836,103 @@
     </w:p>
     <w:p>
       <w:r>
-        <w:t>Purpose: Stores individual issued tickets.</w:t>
+        <w:t xml:space="preserve">Lưu </w:t>
+      </w:r>
+      <w:proofErr w:type="spellStart"/>
+      <w:r>
+        <w:t>từng</w:t>
+      </w:r>
+      <w:proofErr w:type="spellEnd"/>
+      <w:r>
+        <w:t xml:space="preserve"> </w:t>
+      </w:r>
+      <w:proofErr w:type="spellStart"/>
+      <w:r>
+        <w:t>vé</w:t>
+      </w:r>
+      <w:proofErr w:type="spellEnd"/>
+      <w:r>
+        <w:t xml:space="preserve"> riêng </w:t>
+      </w:r>
+      <w:proofErr w:type="spellStart"/>
+      <w:r>
+        <w:t>lẻ</w:t>
+      </w:r>
+      <w:proofErr w:type="spellEnd"/>
+      <w:r>
+        <w:t xml:space="preserve">, </w:t>
+      </w:r>
+      <w:proofErr w:type="spellStart"/>
+      <w:r>
+        <w:t>thay</w:t>
+      </w:r>
+      <w:proofErr w:type="spellEnd"/>
+      <w:r>
+        <w:t xml:space="preserve"> </w:t>
+      </w:r>
+      <w:proofErr w:type="spellStart"/>
+      <w:r>
+        <w:t>vì</w:t>
+      </w:r>
+      <w:proofErr w:type="spellEnd"/>
+      <w:r>
+        <w:t xml:space="preserve"> </w:t>
+      </w:r>
+      <w:proofErr w:type="spellStart"/>
+      <w:r>
+        <w:t>chỉ</w:t>
+      </w:r>
+      <w:proofErr w:type="spellEnd"/>
+      <w:r>
+        <w:t xml:space="preserve"> </w:t>
+      </w:r>
+      <w:proofErr w:type="spellStart"/>
+      <w:r>
+        <w:t>lưu</w:t>
+      </w:r>
+      <w:proofErr w:type="spellEnd"/>
+      <w:r>
+        <w:t xml:space="preserve"> </w:t>
+      </w:r>
+      <w:proofErr w:type="spellStart"/>
+      <w:r>
+        <w:t>tổng</w:t>
+      </w:r>
+      <w:proofErr w:type="spellEnd"/>
+      <w:r>
+        <w:t xml:space="preserve"> </w:t>
+      </w:r>
+      <w:proofErr w:type="spellStart"/>
+      <w:r>
+        <w:t>số</w:t>
+      </w:r>
+      <w:proofErr w:type="spellEnd"/>
+      <w:r>
+        <w:t xml:space="preserve"> </w:t>
+      </w:r>
+      <w:proofErr w:type="spellStart"/>
+      <w:r>
+        <w:t>vé</w:t>
+      </w:r>
+      <w:proofErr w:type="spellEnd"/>
+      <w:r>
+        <w:t xml:space="preserve"> </w:t>
+      </w:r>
+      <w:proofErr w:type="spellStart"/>
+      <w:r>
+        <w:t>trong</w:t>
+      </w:r>
+      <w:proofErr w:type="spellEnd"/>
+      <w:r>
+        <w:t xml:space="preserve"> </w:t>
+      </w:r>
+      <w:proofErr w:type="spellStart"/>
+      <w:r>
+        <w:t>đơn</w:t>
+      </w:r>
+      <w:proofErr w:type="spellEnd"/>
+      <w:r>
+        <w:t>.</w:t>
       </w:r>
     </w:p>
     <w:tbl>
@@ -6020,7 +8388,7 @@
             </w:r>
             <w:proofErr w:type="spellEnd"/>
             <w:r>
-              <w:t xml:space="preserve"> và </w:t>
+              <w:t xml:space="preserve"> </w:t>
             </w:r>
             <w:proofErr w:type="spellStart"/>
             <w:r>
@@ -6301,108 +8669,8 @@
         </w:rPr>
         <w:t>5. Constraints Documentation</w:t>
       </w:r>
-    </w:p>
-    <w:p>
-      <w:proofErr w:type="spellStart"/>
-      <w:r>
-        <w:t>Mục</w:t>
-      </w:r>
-      <w:proofErr w:type="spellEnd"/>
-      <w:r>
-        <w:t xml:space="preserve"> </w:t>
-      </w:r>
-      <w:proofErr w:type="spellStart"/>
-      <w:r>
-        <w:t>này</w:t>
-      </w:r>
-      <w:proofErr w:type="spellEnd"/>
-      <w:r>
-        <w:t xml:space="preserve"> ghi </w:t>
-      </w:r>
-      <w:proofErr w:type="spellStart"/>
-      <w:r>
-        <w:t>rõ</w:t>
-      </w:r>
-      <w:proofErr w:type="spellEnd"/>
-      <w:r>
-        <w:t xml:space="preserve"> </w:t>
-      </w:r>
-      <w:proofErr w:type="spellStart"/>
-      <w:r>
-        <w:t>các</w:t>
-      </w:r>
-      <w:proofErr w:type="spellEnd"/>
-      <w:r>
-        <w:t xml:space="preserve"> </w:t>
-      </w:r>
-      <w:proofErr w:type="spellStart"/>
-      <w:r>
-        <w:t>ràng</w:t>
-      </w:r>
-      <w:proofErr w:type="spellEnd"/>
-      <w:r>
-        <w:t xml:space="preserve"> </w:t>
-      </w:r>
-      <w:proofErr w:type="spellStart"/>
-      <w:r>
-        <w:t>buộc</w:t>
-      </w:r>
-      <w:proofErr w:type="spellEnd"/>
-      <w:r>
-        <w:t xml:space="preserve">, </w:t>
-      </w:r>
-      <w:proofErr w:type="spellStart"/>
-      <w:r>
-        <w:t>cột</w:t>
-      </w:r>
-      <w:proofErr w:type="spellEnd"/>
-      <w:r>
-        <w:t xml:space="preserve"> </w:t>
-      </w:r>
-      <w:proofErr w:type="spellStart"/>
-      <w:r>
-        <w:t>liên</w:t>
-      </w:r>
-      <w:proofErr w:type="spellEnd"/>
-      <w:r>
-        <w:t xml:space="preserve"> </w:t>
-      </w:r>
-      <w:proofErr w:type="spellStart"/>
-      <w:r>
-        <w:t>quan</w:t>
-      </w:r>
-      <w:proofErr w:type="spellEnd"/>
-      <w:r>
-        <w:t xml:space="preserve"> và </w:t>
-      </w:r>
-      <w:proofErr w:type="spellStart"/>
-      <w:r>
-        <w:t>lý</w:t>
-      </w:r>
-      <w:proofErr w:type="spellEnd"/>
-      <w:r>
-        <w:t xml:space="preserve"> do </w:t>
-      </w:r>
-      <w:proofErr w:type="spellStart"/>
-      <w:r>
-        <w:t>sử</w:t>
-      </w:r>
-      <w:proofErr w:type="spellEnd"/>
-      <w:r>
-        <w:t xml:space="preserve"> </w:t>
-      </w:r>
-      <w:proofErr w:type="spellStart"/>
-      <w:r>
-        <w:t>dụng</w:t>
-      </w:r>
-      <w:proofErr w:type="spellEnd"/>
-      <w:r>
-        <w:t xml:space="preserve">. </w:t>
-      </w:r>
-    </w:p>
-    <w:p>
-      <w:r>
-        <w:t>Lab_01.pdf</w:t>
+      <w:r>
+        <w:t>.</w:t>
       </w:r>
     </w:p>
     <w:p>
@@ -10331,14 +12599,7 @@
           <w:b/>
           <w:bCs/>
         </w:rPr>
-        <w:t xml:space="preserve">8. </w:t>
-      </w:r>
-      <w:r>
-        <w:rPr>
-          <w:b/>
-          <w:bCs/>
-        </w:rPr>
-        <w:t xml:space="preserve">Stored Procedure: </w:t>
+        <w:t xml:space="preserve">8. Stored Procedure: </w:t>
       </w:r>
       <w:proofErr w:type="spellStart"/>
       <w:r>
@@ -10574,6 +12835,602 @@
 <file path=word/numbering.xml><?xml version="1.0" encoding="utf-8"?>
 <w:numbering xmlns:wpc="http://schemas.microsoft.com/office/word/2010/wordprocessingCanvas" xmlns:cx="http://schemas.microsoft.com/office/drawing/2014/chartex" xmlns:cx1="http://schemas.microsoft.com/office/drawing/2015/9/8/chartex" xmlns:cx2="http://schemas.microsoft.com/office/drawing/2015/10/21/chartex" xmlns:cx3="http://schemas.microsoft.com/office/drawing/2016/5/9/chartex" xmlns:cx4="http://schemas.microsoft.com/office/drawing/2016/5/10/chartex" xmlns:cx5="http://schemas.microsoft.com/office/drawing/2016/5/11/chartex" xmlns:cx6="http://schemas.microsoft.com/office/drawing/2016/5/12/chartex" xmlns:cx7="http://schemas.microsoft.com/office/drawing/2016/5/13/chartex" xmlns:cx8="http://schemas.microsoft.com/office/drawing/2016/5/14/chartex" xmlns:mc="http://schemas.openxmlformats.org/markup-compatibility/2006" xmlns:aink="http://schemas.microsoft.com/office/drawing/2016/ink" xmlns:am3d="http://schemas.microsoft.com/office/drawing/2017/model3d" xmlns:o="urn:schemas-microsoft-com:office:office" xmlns:oel="http://schemas.microsoft.com/office/2019/extlst" xmlns:r="http://schemas.openxmlformats.org/officeDocument/2006/relationships" xmlns:m="http://schemas.openxmlformats.org/officeDocument/2006/math" xmlns:v="urn:schemas-microsoft-com:vml" xmlns:wp14="http://schemas.microsoft.com/office/word/2010/wordprocessingDrawing" xmlns:wp="http://schemas.openxmlformats.org/drawingml/2006/wordprocessingDrawing" xmlns:w10="urn:schemas-microsoft-com:office:word" xmlns:w="http://schemas.openxmlformats.org/wordprocessingml/2006/main" xmlns:w14="http://schemas.microsoft.com/office/word/2010/wordml" xmlns:w15="http://schemas.microsoft.com/office/word/2012/wordml" xmlns:w16cex="http://schemas.microsoft.com/office/word/2018/wordml/cex" xmlns:w16cid="http://schemas.microsoft.com/office/word/2016/wordml/cid" xmlns:w16="http://schemas.microsoft.com/office/word/2018/wordml" xmlns:w16du="http://schemas.microsoft.com/office/word/2023/wordml/word16du" xmlns:w16sdtdh="http://schemas.microsoft.com/office/word/2020/wordml/sdtdatahash" xmlns:w16sdtfl="http://schemas.microsoft.com/office/word/2024/wordml/sdtformatlock" xmlns:w16se="http://schemas.microsoft.com/office/word/2015/wordml/symex" xmlns:wpg="http://schemas.microsoft.com/office/word/2010/wordprocessingGroup" xmlns:wpi="http://schemas.microsoft.com/office/word/2010/wordprocessingInk" xmlns:wne="http://schemas.microsoft.com/office/word/2006/wordml" xmlns:wps="http://schemas.microsoft.com/office/word/2010/wordprocessingShape" mc:Ignorable="w14 w15 w16se w16cid w16 w16cex w16sdtdh w16sdtfl w16du wp14">
   <w:abstractNum w:abstractNumId="0" w15:restartNumberingAfterBreak="0">
+    <w:nsid w:val="03C83BCF"/>
+    <w:multiLevelType w:val="multilevel"/>
+    <w:tmpl w:val="62D05550"/>
+    <w:lvl w:ilvl="0">
+      <w:start w:val="1"/>
+      <w:numFmt w:val="bullet"/>
+      <w:lvlText w:val=""/>
+      <w:lvlJc w:val="left"/>
+      <w:pPr>
+        <w:tabs>
+          <w:tab w:val="num" w:pos="720"/>
+        </w:tabs>
+        <w:ind w:left="720" w:hanging="360"/>
+      </w:pPr>
+      <w:rPr>
+        <w:rFonts w:ascii="Symbol" w:hAnsi="Symbol" w:hint="default"/>
+        <w:sz w:val="20"/>
+      </w:rPr>
+    </w:lvl>
+    <w:lvl w:ilvl="1" w:tentative="1">
+      <w:start w:val="1"/>
+      <w:numFmt w:val="bullet"/>
+      <w:lvlText w:val="o"/>
+      <w:lvlJc w:val="left"/>
+      <w:pPr>
+        <w:tabs>
+          <w:tab w:val="num" w:pos="1440"/>
+        </w:tabs>
+        <w:ind w:left="1440" w:hanging="360"/>
+      </w:pPr>
+      <w:rPr>
+        <w:rFonts w:ascii="Courier New" w:hAnsi="Courier New" w:hint="default"/>
+        <w:sz w:val="20"/>
+      </w:rPr>
+    </w:lvl>
+    <w:lvl w:ilvl="2" w:tentative="1">
+      <w:start w:val="1"/>
+      <w:numFmt w:val="bullet"/>
+      <w:lvlText w:val=""/>
+      <w:lvlJc w:val="left"/>
+      <w:pPr>
+        <w:tabs>
+          <w:tab w:val="num" w:pos="2160"/>
+        </w:tabs>
+        <w:ind w:left="2160" w:hanging="360"/>
+      </w:pPr>
+      <w:rPr>
+        <w:rFonts w:ascii="Wingdings" w:hAnsi="Wingdings" w:hint="default"/>
+        <w:sz w:val="20"/>
+      </w:rPr>
+    </w:lvl>
+    <w:lvl w:ilvl="3" w:tentative="1">
+      <w:start w:val="1"/>
+      <w:numFmt w:val="bullet"/>
+      <w:lvlText w:val=""/>
+      <w:lvlJc w:val="left"/>
+      <w:pPr>
+        <w:tabs>
+          <w:tab w:val="num" w:pos="2880"/>
+        </w:tabs>
+        <w:ind w:left="2880" w:hanging="360"/>
+      </w:pPr>
+      <w:rPr>
+        <w:rFonts w:ascii="Wingdings" w:hAnsi="Wingdings" w:hint="default"/>
+        <w:sz w:val="20"/>
+      </w:rPr>
+    </w:lvl>
+    <w:lvl w:ilvl="4" w:tentative="1">
+      <w:start w:val="1"/>
+      <w:numFmt w:val="bullet"/>
+      <w:lvlText w:val=""/>
+      <w:lvlJc w:val="left"/>
+      <w:pPr>
+        <w:tabs>
+          <w:tab w:val="num" w:pos="3600"/>
+        </w:tabs>
+        <w:ind w:left="3600" w:hanging="360"/>
+      </w:pPr>
+      <w:rPr>
+        <w:rFonts w:ascii="Wingdings" w:hAnsi="Wingdings" w:hint="default"/>
+        <w:sz w:val="20"/>
+      </w:rPr>
+    </w:lvl>
+    <w:lvl w:ilvl="5" w:tentative="1">
+      <w:start w:val="1"/>
+      <w:numFmt w:val="bullet"/>
+      <w:lvlText w:val=""/>
+      <w:lvlJc w:val="left"/>
+      <w:pPr>
+        <w:tabs>
+          <w:tab w:val="num" w:pos="4320"/>
+        </w:tabs>
+        <w:ind w:left="4320" w:hanging="360"/>
+      </w:pPr>
+      <w:rPr>
+        <w:rFonts w:ascii="Wingdings" w:hAnsi="Wingdings" w:hint="default"/>
+        <w:sz w:val="20"/>
+      </w:rPr>
+    </w:lvl>
+    <w:lvl w:ilvl="6" w:tentative="1">
+      <w:start w:val="1"/>
+      <w:numFmt w:val="bullet"/>
+      <w:lvlText w:val=""/>
+      <w:lvlJc w:val="left"/>
+      <w:pPr>
+        <w:tabs>
+          <w:tab w:val="num" w:pos="5040"/>
+        </w:tabs>
+        <w:ind w:left="5040" w:hanging="360"/>
+      </w:pPr>
+      <w:rPr>
+        <w:rFonts w:ascii="Wingdings" w:hAnsi="Wingdings" w:hint="default"/>
+        <w:sz w:val="20"/>
+      </w:rPr>
+    </w:lvl>
+    <w:lvl w:ilvl="7" w:tentative="1">
+      <w:start w:val="1"/>
+      <w:numFmt w:val="bullet"/>
+      <w:lvlText w:val=""/>
+      <w:lvlJc w:val="left"/>
+      <w:pPr>
+        <w:tabs>
+          <w:tab w:val="num" w:pos="5760"/>
+        </w:tabs>
+        <w:ind w:left="5760" w:hanging="360"/>
+      </w:pPr>
+      <w:rPr>
+        <w:rFonts w:ascii="Wingdings" w:hAnsi="Wingdings" w:hint="default"/>
+        <w:sz w:val="20"/>
+      </w:rPr>
+    </w:lvl>
+    <w:lvl w:ilvl="8" w:tentative="1">
+      <w:start w:val="1"/>
+      <w:numFmt w:val="bullet"/>
+      <w:lvlText w:val=""/>
+      <w:lvlJc w:val="left"/>
+      <w:pPr>
+        <w:tabs>
+          <w:tab w:val="num" w:pos="6480"/>
+        </w:tabs>
+        <w:ind w:left="6480" w:hanging="360"/>
+      </w:pPr>
+      <w:rPr>
+        <w:rFonts w:ascii="Wingdings" w:hAnsi="Wingdings" w:hint="default"/>
+        <w:sz w:val="20"/>
+      </w:rPr>
+    </w:lvl>
+  </w:abstractNum>
+  <w:abstractNum w:abstractNumId="1" w15:restartNumberingAfterBreak="0">
+    <w:nsid w:val="12271E4F"/>
+    <w:multiLevelType w:val="multilevel"/>
+    <w:tmpl w:val="F7B0DD9E"/>
+    <w:lvl w:ilvl="0">
+      <w:start w:val="1"/>
+      <w:numFmt w:val="bullet"/>
+      <w:lvlText w:val=""/>
+      <w:lvlJc w:val="left"/>
+      <w:pPr>
+        <w:tabs>
+          <w:tab w:val="num" w:pos="720"/>
+        </w:tabs>
+        <w:ind w:left="720" w:hanging="360"/>
+      </w:pPr>
+      <w:rPr>
+        <w:rFonts w:ascii="Symbol" w:hAnsi="Symbol" w:hint="default"/>
+        <w:sz w:val="20"/>
+      </w:rPr>
+    </w:lvl>
+    <w:lvl w:ilvl="1" w:tentative="1">
+      <w:start w:val="1"/>
+      <w:numFmt w:val="bullet"/>
+      <w:lvlText w:val="o"/>
+      <w:lvlJc w:val="left"/>
+      <w:pPr>
+        <w:tabs>
+          <w:tab w:val="num" w:pos="1440"/>
+        </w:tabs>
+        <w:ind w:left="1440" w:hanging="360"/>
+      </w:pPr>
+      <w:rPr>
+        <w:rFonts w:ascii="Courier New" w:hAnsi="Courier New" w:hint="default"/>
+        <w:sz w:val="20"/>
+      </w:rPr>
+    </w:lvl>
+    <w:lvl w:ilvl="2" w:tentative="1">
+      <w:start w:val="1"/>
+      <w:numFmt w:val="bullet"/>
+      <w:lvlText w:val=""/>
+      <w:lvlJc w:val="left"/>
+      <w:pPr>
+        <w:tabs>
+          <w:tab w:val="num" w:pos="2160"/>
+        </w:tabs>
+        <w:ind w:left="2160" w:hanging="360"/>
+      </w:pPr>
+      <w:rPr>
+        <w:rFonts w:ascii="Wingdings" w:hAnsi="Wingdings" w:hint="default"/>
+        <w:sz w:val="20"/>
+      </w:rPr>
+    </w:lvl>
+    <w:lvl w:ilvl="3" w:tentative="1">
+      <w:start w:val="1"/>
+      <w:numFmt w:val="bullet"/>
+      <w:lvlText w:val=""/>
+      <w:lvlJc w:val="left"/>
+      <w:pPr>
+        <w:tabs>
+          <w:tab w:val="num" w:pos="2880"/>
+        </w:tabs>
+        <w:ind w:left="2880" w:hanging="360"/>
+      </w:pPr>
+      <w:rPr>
+        <w:rFonts w:ascii="Wingdings" w:hAnsi="Wingdings" w:hint="default"/>
+        <w:sz w:val="20"/>
+      </w:rPr>
+    </w:lvl>
+    <w:lvl w:ilvl="4" w:tentative="1">
+      <w:start w:val="1"/>
+      <w:numFmt w:val="bullet"/>
+      <w:lvlText w:val=""/>
+      <w:lvlJc w:val="left"/>
+      <w:pPr>
+        <w:tabs>
+          <w:tab w:val="num" w:pos="3600"/>
+        </w:tabs>
+        <w:ind w:left="3600" w:hanging="360"/>
+      </w:pPr>
+      <w:rPr>
+        <w:rFonts w:ascii="Wingdings" w:hAnsi="Wingdings" w:hint="default"/>
+        <w:sz w:val="20"/>
+      </w:rPr>
+    </w:lvl>
+    <w:lvl w:ilvl="5" w:tentative="1">
+      <w:start w:val="1"/>
+      <w:numFmt w:val="bullet"/>
+      <w:lvlText w:val=""/>
+      <w:lvlJc w:val="left"/>
+      <w:pPr>
+        <w:tabs>
+          <w:tab w:val="num" w:pos="4320"/>
+        </w:tabs>
+        <w:ind w:left="4320" w:hanging="360"/>
+      </w:pPr>
+      <w:rPr>
+        <w:rFonts w:ascii="Wingdings" w:hAnsi="Wingdings" w:hint="default"/>
+        <w:sz w:val="20"/>
+      </w:rPr>
+    </w:lvl>
+    <w:lvl w:ilvl="6" w:tentative="1">
+      <w:start w:val="1"/>
+      <w:numFmt w:val="bullet"/>
+      <w:lvlText w:val=""/>
+      <w:lvlJc w:val="left"/>
+      <w:pPr>
+        <w:tabs>
+          <w:tab w:val="num" w:pos="5040"/>
+        </w:tabs>
+        <w:ind w:left="5040" w:hanging="360"/>
+      </w:pPr>
+      <w:rPr>
+        <w:rFonts w:ascii="Wingdings" w:hAnsi="Wingdings" w:hint="default"/>
+        <w:sz w:val="20"/>
+      </w:rPr>
+    </w:lvl>
+    <w:lvl w:ilvl="7" w:tentative="1">
+      <w:start w:val="1"/>
+      <w:numFmt w:val="bullet"/>
+      <w:lvlText w:val=""/>
+      <w:lvlJc w:val="left"/>
+      <w:pPr>
+        <w:tabs>
+          <w:tab w:val="num" w:pos="5760"/>
+        </w:tabs>
+        <w:ind w:left="5760" w:hanging="360"/>
+      </w:pPr>
+      <w:rPr>
+        <w:rFonts w:ascii="Wingdings" w:hAnsi="Wingdings" w:hint="default"/>
+        <w:sz w:val="20"/>
+      </w:rPr>
+    </w:lvl>
+    <w:lvl w:ilvl="8" w:tentative="1">
+      <w:start w:val="1"/>
+      <w:numFmt w:val="bullet"/>
+      <w:lvlText w:val=""/>
+      <w:lvlJc w:val="left"/>
+      <w:pPr>
+        <w:tabs>
+          <w:tab w:val="num" w:pos="6480"/>
+        </w:tabs>
+        <w:ind w:left="6480" w:hanging="360"/>
+      </w:pPr>
+      <w:rPr>
+        <w:rFonts w:ascii="Wingdings" w:hAnsi="Wingdings" w:hint="default"/>
+        <w:sz w:val="20"/>
+      </w:rPr>
+    </w:lvl>
+  </w:abstractNum>
+  <w:abstractNum w:abstractNumId="2" w15:restartNumberingAfterBreak="0">
+    <w:nsid w:val="14DC7647"/>
+    <w:multiLevelType w:val="multilevel"/>
+    <w:tmpl w:val="AEB03D88"/>
+    <w:lvl w:ilvl="0">
+      <w:start w:val="1"/>
+      <w:numFmt w:val="bullet"/>
+      <w:lvlText w:val=""/>
+      <w:lvlJc w:val="left"/>
+      <w:pPr>
+        <w:tabs>
+          <w:tab w:val="num" w:pos="720"/>
+        </w:tabs>
+        <w:ind w:left="720" w:hanging="360"/>
+      </w:pPr>
+      <w:rPr>
+        <w:rFonts w:ascii="Symbol" w:hAnsi="Symbol" w:hint="default"/>
+        <w:sz w:val="20"/>
+      </w:rPr>
+    </w:lvl>
+    <w:lvl w:ilvl="1" w:tentative="1">
+      <w:start w:val="1"/>
+      <w:numFmt w:val="bullet"/>
+      <w:lvlText w:val="o"/>
+      <w:lvlJc w:val="left"/>
+      <w:pPr>
+        <w:tabs>
+          <w:tab w:val="num" w:pos="1440"/>
+        </w:tabs>
+        <w:ind w:left="1440" w:hanging="360"/>
+      </w:pPr>
+      <w:rPr>
+        <w:rFonts w:ascii="Courier New" w:hAnsi="Courier New" w:hint="default"/>
+        <w:sz w:val="20"/>
+      </w:rPr>
+    </w:lvl>
+    <w:lvl w:ilvl="2" w:tentative="1">
+      <w:start w:val="1"/>
+      <w:numFmt w:val="bullet"/>
+      <w:lvlText w:val=""/>
+      <w:lvlJc w:val="left"/>
+      <w:pPr>
+        <w:tabs>
+          <w:tab w:val="num" w:pos="2160"/>
+        </w:tabs>
+        <w:ind w:left="2160" w:hanging="360"/>
+      </w:pPr>
+      <w:rPr>
+        <w:rFonts w:ascii="Wingdings" w:hAnsi="Wingdings" w:hint="default"/>
+        <w:sz w:val="20"/>
+      </w:rPr>
+    </w:lvl>
+    <w:lvl w:ilvl="3" w:tentative="1">
+      <w:start w:val="1"/>
+      <w:numFmt w:val="bullet"/>
+      <w:lvlText w:val=""/>
+      <w:lvlJc w:val="left"/>
+      <w:pPr>
+        <w:tabs>
+          <w:tab w:val="num" w:pos="2880"/>
+        </w:tabs>
+        <w:ind w:left="2880" w:hanging="360"/>
+      </w:pPr>
+      <w:rPr>
+        <w:rFonts w:ascii="Wingdings" w:hAnsi="Wingdings" w:hint="default"/>
+        <w:sz w:val="20"/>
+      </w:rPr>
+    </w:lvl>
+    <w:lvl w:ilvl="4" w:tentative="1">
+      <w:start w:val="1"/>
+      <w:numFmt w:val="bullet"/>
+      <w:lvlText w:val=""/>
+      <w:lvlJc w:val="left"/>
+      <w:pPr>
+        <w:tabs>
+          <w:tab w:val="num" w:pos="3600"/>
+        </w:tabs>
+        <w:ind w:left="3600" w:hanging="360"/>
+      </w:pPr>
+      <w:rPr>
+        <w:rFonts w:ascii="Wingdings" w:hAnsi="Wingdings" w:hint="default"/>
+        <w:sz w:val="20"/>
+      </w:rPr>
+    </w:lvl>
+    <w:lvl w:ilvl="5" w:tentative="1">
+      <w:start w:val="1"/>
+      <w:numFmt w:val="bullet"/>
+      <w:lvlText w:val=""/>
+      <w:lvlJc w:val="left"/>
+      <w:pPr>
+        <w:tabs>
+          <w:tab w:val="num" w:pos="4320"/>
+        </w:tabs>
+        <w:ind w:left="4320" w:hanging="360"/>
+      </w:pPr>
+      <w:rPr>
+        <w:rFonts w:ascii="Wingdings" w:hAnsi="Wingdings" w:hint="default"/>
+        <w:sz w:val="20"/>
+      </w:rPr>
+    </w:lvl>
+    <w:lvl w:ilvl="6" w:tentative="1">
+      <w:start w:val="1"/>
+      <w:numFmt w:val="bullet"/>
+      <w:lvlText w:val=""/>
+      <w:lvlJc w:val="left"/>
+      <w:pPr>
+        <w:tabs>
+          <w:tab w:val="num" w:pos="5040"/>
+        </w:tabs>
+        <w:ind w:left="5040" w:hanging="360"/>
+      </w:pPr>
+      <w:rPr>
+        <w:rFonts w:ascii="Wingdings" w:hAnsi="Wingdings" w:hint="default"/>
+        <w:sz w:val="20"/>
+      </w:rPr>
+    </w:lvl>
+    <w:lvl w:ilvl="7" w:tentative="1">
+      <w:start w:val="1"/>
+      <w:numFmt w:val="bullet"/>
+      <w:lvlText w:val=""/>
+      <w:lvlJc w:val="left"/>
+      <w:pPr>
+        <w:tabs>
+          <w:tab w:val="num" w:pos="5760"/>
+        </w:tabs>
+        <w:ind w:left="5760" w:hanging="360"/>
+      </w:pPr>
+      <w:rPr>
+        <w:rFonts w:ascii="Wingdings" w:hAnsi="Wingdings" w:hint="default"/>
+        <w:sz w:val="20"/>
+      </w:rPr>
+    </w:lvl>
+    <w:lvl w:ilvl="8" w:tentative="1">
+      <w:start w:val="1"/>
+      <w:numFmt w:val="bullet"/>
+      <w:lvlText w:val=""/>
+      <w:lvlJc w:val="left"/>
+      <w:pPr>
+        <w:tabs>
+          <w:tab w:val="num" w:pos="6480"/>
+        </w:tabs>
+        <w:ind w:left="6480" w:hanging="360"/>
+      </w:pPr>
+      <w:rPr>
+        <w:rFonts w:ascii="Wingdings" w:hAnsi="Wingdings" w:hint="default"/>
+        <w:sz w:val="20"/>
+      </w:rPr>
+    </w:lvl>
+  </w:abstractNum>
+  <w:abstractNum w:abstractNumId="3" w15:restartNumberingAfterBreak="0">
+    <w:nsid w:val="179E3EB3"/>
+    <w:multiLevelType w:val="multilevel"/>
+    <w:tmpl w:val="58F29AD8"/>
+    <w:lvl w:ilvl="0">
+      <w:start w:val="1"/>
+      <w:numFmt w:val="bullet"/>
+      <w:lvlText w:val=""/>
+      <w:lvlJc w:val="left"/>
+      <w:pPr>
+        <w:tabs>
+          <w:tab w:val="num" w:pos="720"/>
+        </w:tabs>
+        <w:ind w:left="720" w:hanging="360"/>
+      </w:pPr>
+      <w:rPr>
+        <w:rFonts w:ascii="Symbol" w:hAnsi="Symbol" w:hint="default"/>
+        <w:sz w:val="20"/>
+      </w:rPr>
+    </w:lvl>
+    <w:lvl w:ilvl="1" w:tentative="1">
+      <w:start w:val="1"/>
+      <w:numFmt w:val="bullet"/>
+      <w:lvlText w:val="o"/>
+      <w:lvlJc w:val="left"/>
+      <w:pPr>
+        <w:tabs>
+          <w:tab w:val="num" w:pos="1440"/>
+        </w:tabs>
+        <w:ind w:left="1440" w:hanging="360"/>
+      </w:pPr>
+      <w:rPr>
+        <w:rFonts w:ascii="Courier New" w:hAnsi="Courier New" w:hint="default"/>
+        <w:sz w:val="20"/>
+      </w:rPr>
+    </w:lvl>
+    <w:lvl w:ilvl="2" w:tentative="1">
+      <w:start w:val="1"/>
+      <w:numFmt w:val="bullet"/>
+      <w:lvlText w:val=""/>
+      <w:lvlJc w:val="left"/>
+      <w:pPr>
+        <w:tabs>
+          <w:tab w:val="num" w:pos="2160"/>
+        </w:tabs>
+        <w:ind w:left="2160" w:hanging="360"/>
+      </w:pPr>
+      <w:rPr>
+        <w:rFonts w:ascii="Wingdings" w:hAnsi="Wingdings" w:hint="default"/>
+        <w:sz w:val="20"/>
+      </w:rPr>
+    </w:lvl>
+    <w:lvl w:ilvl="3" w:tentative="1">
+      <w:start w:val="1"/>
+      <w:numFmt w:val="bullet"/>
+      <w:lvlText w:val=""/>
+      <w:lvlJc w:val="left"/>
+      <w:pPr>
+        <w:tabs>
+          <w:tab w:val="num" w:pos="2880"/>
+        </w:tabs>
+        <w:ind w:left="2880" w:hanging="360"/>
+      </w:pPr>
+      <w:rPr>
+        <w:rFonts w:ascii="Wingdings" w:hAnsi="Wingdings" w:hint="default"/>
+        <w:sz w:val="20"/>
+      </w:rPr>
+    </w:lvl>
+    <w:lvl w:ilvl="4" w:tentative="1">
+      <w:start w:val="1"/>
+      <w:numFmt w:val="bullet"/>
+      <w:lvlText w:val=""/>
+      <w:lvlJc w:val="left"/>
+      <w:pPr>
+        <w:tabs>
+          <w:tab w:val="num" w:pos="3600"/>
+        </w:tabs>
+        <w:ind w:left="3600" w:hanging="360"/>
+      </w:pPr>
+      <w:rPr>
+        <w:rFonts w:ascii="Wingdings" w:hAnsi="Wingdings" w:hint="default"/>
+        <w:sz w:val="20"/>
+      </w:rPr>
+    </w:lvl>
+    <w:lvl w:ilvl="5" w:tentative="1">
+      <w:start w:val="1"/>
+      <w:numFmt w:val="bullet"/>
+      <w:lvlText w:val=""/>
+      <w:lvlJc w:val="left"/>
+      <w:pPr>
+        <w:tabs>
+          <w:tab w:val="num" w:pos="4320"/>
+        </w:tabs>
+        <w:ind w:left="4320" w:hanging="360"/>
+      </w:pPr>
+      <w:rPr>
+        <w:rFonts w:ascii="Wingdings" w:hAnsi="Wingdings" w:hint="default"/>
+        <w:sz w:val="20"/>
+      </w:rPr>
+    </w:lvl>
+    <w:lvl w:ilvl="6" w:tentative="1">
+      <w:start w:val="1"/>
+      <w:numFmt w:val="bullet"/>
+      <w:lvlText w:val=""/>
+      <w:lvlJc w:val="left"/>
+      <w:pPr>
+        <w:tabs>
+          <w:tab w:val="num" w:pos="5040"/>
+        </w:tabs>
+        <w:ind w:left="5040" w:hanging="360"/>
+      </w:pPr>
+      <w:rPr>
+        <w:rFonts w:ascii="Wingdings" w:hAnsi="Wingdings" w:hint="default"/>
+        <w:sz w:val="20"/>
+      </w:rPr>
+    </w:lvl>
+    <w:lvl w:ilvl="7" w:tentative="1">
+      <w:start w:val="1"/>
+      <w:numFmt w:val="bullet"/>
+      <w:lvlText w:val=""/>
+      <w:lvlJc w:val="left"/>
+      <w:pPr>
+        <w:tabs>
+          <w:tab w:val="num" w:pos="5760"/>
+        </w:tabs>
+        <w:ind w:left="5760" w:hanging="360"/>
+      </w:pPr>
+      <w:rPr>
+        <w:rFonts w:ascii="Wingdings" w:hAnsi="Wingdings" w:hint="default"/>
+        <w:sz w:val="20"/>
+      </w:rPr>
+    </w:lvl>
+    <w:lvl w:ilvl="8" w:tentative="1">
+      <w:start w:val="1"/>
+      <w:numFmt w:val="bullet"/>
+      <w:lvlText w:val=""/>
+      <w:lvlJc w:val="left"/>
+      <w:pPr>
+        <w:tabs>
+          <w:tab w:val="num" w:pos="6480"/>
+        </w:tabs>
+        <w:ind w:left="6480" w:hanging="360"/>
+      </w:pPr>
+      <w:rPr>
+        <w:rFonts w:ascii="Wingdings" w:hAnsi="Wingdings" w:hint="default"/>
+        <w:sz w:val="20"/>
+      </w:rPr>
+    </w:lvl>
+  </w:abstractNum>
+  <w:abstractNum w:abstractNumId="4" w15:restartNumberingAfterBreak="0">
     <w:nsid w:val="1A9A4059"/>
     <w:multiLevelType w:val="multilevel"/>
     <w:tmpl w:val="BA305446"/>
@@ -10722,7 +13579,156 @@
       </w:rPr>
     </w:lvl>
   </w:abstractNum>
-  <w:abstractNum w:abstractNumId="1" w15:restartNumberingAfterBreak="0">
+  <w:abstractNum w:abstractNumId="5" w15:restartNumberingAfterBreak="0">
+    <w:nsid w:val="23C322CF"/>
+    <w:multiLevelType w:val="multilevel"/>
+    <w:tmpl w:val="166C8FDC"/>
+    <w:lvl w:ilvl="0">
+      <w:start w:val="1"/>
+      <w:numFmt w:val="bullet"/>
+      <w:lvlText w:val=""/>
+      <w:lvlJc w:val="left"/>
+      <w:pPr>
+        <w:tabs>
+          <w:tab w:val="num" w:pos="720"/>
+        </w:tabs>
+        <w:ind w:left="720" w:hanging="360"/>
+      </w:pPr>
+      <w:rPr>
+        <w:rFonts w:ascii="Symbol" w:hAnsi="Symbol" w:hint="default"/>
+        <w:sz w:val="20"/>
+      </w:rPr>
+    </w:lvl>
+    <w:lvl w:ilvl="1" w:tentative="1">
+      <w:start w:val="1"/>
+      <w:numFmt w:val="bullet"/>
+      <w:lvlText w:val="o"/>
+      <w:lvlJc w:val="left"/>
+      <w:pPr>
+        <w:tabs>
+          <w:tab w:val="num" w:pos="1440"/>
+        </w:tabs>
+        <w:ind w:left="1440" w:hanging="360"/>
+      </w:pPr>
+      <w:rPr>
+        <w:rFonts w:ascii="Courier New" w:hAnsi="Courier New" w:hint="default"/>
+        <w:sz w:val="20"/>
+      </w:rPr>
+    </w:lvl>
+    <w:lvl w:ilvl="2" w:tentative="1">
+      <w:start w:val="1"/>
+      <w:numFmt w:val="bullet"/>
+      <w:lvlText w:val=""/>
+      <w:lvlJc w:val="left"/>
+      <w:pPr>
+        <w:tabs>
+          <w:tab w:val="num" w:pos="2160"/>
+        </w:tabs>
+        <w:ind w:left="2160" w:hanging="360"/>
+      </w:pPr>
+      <w:rPr>
+        <w:rFonts w:ascii="Wingdings" w:hAnsi="Wingdings" w:hint="default"/>
+        <w:sz w:val="20"/>
+      </w:rPr>
+    </w:lvl>
+    <w:lvl w:ilvl="3" w:tentative="1">
+      <w:start w:val="1"/>
+      <w:numFmt w:val="bullet"/>
+      <w:lvlText w:val=""/>
+      <w:lvlJc w:val="left"/>
+      <w:pPr>
+        <w:tabs>
+          <w:tab w:val="num" w:pos="2880"/>
+        </w:tabs>
+        <w:ind w:left="2880" w:hanging="360"/>
+      </w:pPr>
+      <w:rPr>
+        <w:rFonts w:ascii="Wingdings" w:hAnsi="Wingdings" w:hint="default"/>
+        <w:sz w:val="20"/>
+      </w:rPr>
+    </w:lvl>
+    <w:lvl w:ilvl="4" w:tentative="1">
+      <w:start w:val="1"/>
+      <w:numFmt w:val="bullet"/>
+      <w:lvlText w:val=""/>
+      <w:lvlJc w:val="left"/>
+      <w:pPr>
+        <w:tabs>
+          <w:tab w:val="num" w:pos="3600"/>
+        </w:tabs>
+        <w:ind w:left="3600" w:hanging="360"/>
+      </w:pPr>
+      <w:rPr>
+        <w:rFonts w:ascii="Wingdings" w:hAnsi="Wingdings" w:hint="default"/>
+        <w:sz w:val="20"/>
+      </w:rPr>
+    </w:lvl>
+    <w:lvl w:ilvl="5" w:tentative="1">
+      <w:start w:val="1"/>
+      <w:numFmt w:val="bullet"/>
+      <w:lvlText w:val=""/>
+      <w:lvlJc w:val="left"/>
+      <w:pPr>
+        <w:tabs>
+          <w:tab w:val="num" w:pos="4320"/>
+        </w:tabs>
+        <w:ind w:left="4320" w:hanging="360"/>
+      </w:pPr>
+      <w:rPr>
+        <w:rFonts w:ascii="Wingdings" w:hAnsi="Wingdings" w:hint="default"/>
+        <w:sz w:val="20"/>
+      </w:rPr>
+    </w:lvl>
+    <w:lvl w:ilvl="6" w:tentative="1">
+      <w:start w:val="1"/>
+      <w:numFmt w:val="bullet"/>
+      <w:lvlText w:val=""/>
+      <w:lvlJc w:val="left"/>
+      <w:pPr>
+        <w:tabs>
+          <w:tab w:val="num" w:pos="5040"/>
+        </w:tabs>
+        <w:ind w:left="5040" w:hanging="360"/>
+      </w:pPr>
+      <w:rPr>
+        <w:rFonts w:ascii="Wingdings" w:hAnsi="Wingdings" w:hint="default"/>
+        <w:sz w:val="20"/>
+      </w:rPr>
+    </w:lvl>
+    <w:lvl w:ilvl="7" w:tentative="1">
+      <w:start w:val="1"/>
+      <w:numFmt w:val="bullet"/>
+      <w:lvlText w:val=""/>
+      <w:lvlJc w:val="left"/>
+      <w:pPr>
+        <w:tabs>
+          <w:tab w:val="num" w:pos="5760"/>
+        </w:tabs>
+        <w:ind w:left="5760" w:hanging="360"/>
+      </w:pPr>
+      <w:rPr>
+        <w:rFonts w:ascii="Wingdings" w:hAnsi="Wingdings" w:hint="default"/>
+        <w:sz w:val="20"/>
+      </w:rPr>
+    </w:lvl>
+    <w:lvl w:ilvl="8" w:tentative="1">
+      <w:start w:val="1"/>
+      <w:numFmt w:val="bullet"/>
+      <w:lvlText w:val=""/>
+      <w:lvlJc w:val="left"/>
+      <w:pPr>
+        <w:tabs>
+          <w:tab w:val="num" w:pos="6480"/>
+        </w:tabs>
+        <w:ind w:left="6480" w:hanging="360"/>
+      </w:pPr>
+      <w:rPr>
+        <w:rFonts w:ascii="Wingdings" w:hAnsi="Wingdings" w:hint="default"/>
+        <w:sz w:val="20"/>
+      </w:rPr>
+    </w:lvl>
+  </w:abstractNum>
+  <w:abstractNum w:abstractNumId="6" w15:restartNumberingAfterBreak="0">
     <w:nsid w:val="49910EE7"/>
     <w:multiLevelType w:val="multilevel"/>
     <w:tmpl w:val="AC5E0526"/>
@@ -10871,7 +13877,156 @@
       </w:rPr>
     </w:lvl>
   </w:abstractNum>
-  <w:abstractNum w:abstractNumId="2" w15:restartNumberingAfterBreak="0">
+  <w:abstractNum w:abstractNumId="7" w15:restartNumberingAfterBreak="0">
+    <w:nsid w:val="53F52E39"/>
+    <w:multiLevelType w:val="multilevel"/>
+    <w:tmpl w:val="1062CFE4"/>
+    <w:lvl w:ilvl="0">
+      <w:start w:val="1"/>
+      <w:numFmt w:val="bullet"/>
+      <w:lvlText w:val=""/>
+      <w:lvlJc w:val="left"/>
+      <w:pPr>
+        <w:tabs>
+          <w:tab w:val="num" w:pos="720"/>
+        </w:tabs>
+        <w:ind w:left="720" w:hanging="360"/>
+      </w:pPr>
+      <w:rPr>
+        <w:rFonts w:ascii="Symbol" w:hAnsi="Symbol" w:hint="default"/>
+        <w:sz w:val="20"/>
+      </w:rPr>
+    </w:lvl>
+    <w:lvl w:ilvl="1" w:tentative="1">
+      <w:start w:val="1"/>
+      <w:numFmt w:val="bullet"/>
+      <w:lvlText w:val="o"/>
+      <w:lvlJc w:val="left"/>
+      <w:pPr>
+        <w:tabs>
+          <w:tab w:val="num" w:pos="1440"/>
+        </w:tabs>
+        <w:ind w:left="1440" w:hanging="360"/>
+      </w:pPr>
+      <w:rPr>
+        <w:rFonts w:ascii="Courier New" w:hAnsi="Courier New" w:hint="default"/>
+        <w:sz w:val="20"/>
+      </w:rPr>
+    </w:lvl>
+    <w:lvl w:ilvl="2" w:tentative="1">
+      <w:start w:val="1"/>
+      <w:numFmt w:val="bullet"/>
+      <w:lvlText w:val=""/>
+      <w:lvlJc w:val="left"/>
+      <w:pPr>
+        <w:tabs>
+          <w:tab w:val="num" w:pos="2160"/>
+        </w:tabs>
+        <w:ind w:left="2160" w:hanging="360"/>
+      </w:pPr>
+      <w:rPr>
+        <w:rFonts w:ascii="Wingdings" w:hAnsi="Wingdings" w:hint="default"/>
+        <w:sz w:val="20"/>
+      </w:rPr>
+    </w:lvl>
+    <w:lvl w:ilvl="3" w:tentative="1">
+      <w:start w:val="1"/>
+      <w:numFmt w:val="bullet"/>
+      <w:lvlText w:val=""/>
+      <w:lvlJc w:val="left"/>
+      <w:pPr>
+        <w:tabs>
+          <w:tab w:val="num" w:pos="2880"/>
+        </w:tabs>
+        <w:ind w:left="2880" w:hanging="360"/>
+      </w:pPr>
+      <w:rPr>
+        <w:rFonts w:ascii="Wingdings" w:hAnsi="Wingdings" w:hint="default"/>
+        <w:sz w:val="20"/>
+      </w:rPr>
+    </w:lvl>
+    <w:lvl w:ilvl="4" w:tentative="1">
+      <w:start w:val="1"/>
+      <w:numFmt w:val="bullet"/>
+      <w:lvlText w:val=""/>
+      <w:lvlJc w:val="left"/>
+      <w:pPr>
+        <w:tabs>
+          <w:tab w:val="num" w:pos="3600"/>
+        </w:tabs>
+        <w:ind w:left="3600" w:hanging="360"/>
+      </w:pPr>
+      <w:rPr>
+        <w:rFonts w:ascii="Wingdings" w:hAnsi="Wingdings" w:hint="default"/>
+        <w:sz w:val="20"/>
+      </w:rPr>
+    </w:lvl>
+    <w:lvl w:ilvl="5" w:tentative="1">
+      <w:start w:val="1"/>
+      <w:numFmt w:val="bullet"/>
+      <w:lvlText w:val=""/>
+      <w:lvlJc w:val="left"/>
+      <w:pPr>
+        <w:tabs>
+          <w:tab w:val="num" w:pos="4320"/>
+        </w:tabs>
+        <w:ind w:left="4320" w:hanging="360"/>
+      </w:pPr>
+      <w:rPr>
+        <w:rFonts w:ascii="Wingdings" w:hAnsi="Wingdings" w:hint="default"/>
+        <w:sz w:val="20"/>
+      </w:rPr>
+    </w:lvl>
+    <w:lvl w:ilvl="6" w:tentative="1">
+      <w:start w:val="1"/>
+      <w:numFmt w:val="bullet"/>
+      <w:lvlText w:val=""/>
+      <w:lvlJc w:val="left"/>
+      <w:pPr>
+        <w:tabs>
+          <w:tab w:val="num" w:pos="5040"/>
+        </w:tabs>
+        <w:ind w:left="5040" w:hanging="360"/>
+      </w:pPr>
+      <w:rPr>
+        <w:rFonts w:ascii="Wingdings" w:hAnsi="Wingdings" w:hint="default"/>
+        <w:sz w:val="20"/>
+      </w:rPr>
+    </w:lvl>
+    <w:lvl w:ilvl="7" w:tentative="1">
+      <w:start w:val="1"/>
+      <w:numFmt w:val="bullet"/>
+      <w:lvlText w:val=""/>
+      <w:lvlJc w:val="left"/>
+      <w:pPr>
+        <w:tabs>
+          <w:tab w:val="num" w:pos="5760"/>
+        </w:tabs>
+        <w:ind w:left="5760" w:hanging="360"/>
+      </w:pPr>
+      <w:rPr>
+        <w:rFonts w:ascii="Wingdings" w:hAnsi="Wingdings" w:hint="default"/>
+        <w:sz w:val="20"/>
+      </w:rPr>
+    </w:lvl>
+    <w:lvl w:ilvl="8" w:tentative="1">
+      <w:start w:val="1"/>
+      <w:numFmt w:val="bullet"/>
+      <w:lvlText w:val=""/>
+      <w:lvlJc w:val="left"/>
+      <w:pPr>
+        <w:tabs>
+          <w:tab w:val="num" w:pos="6480"/>
+        </w:tabs>
+        <w:ind w:left="6480" w:hanging="360"/>
+      </w:pPr>
+      <w:rPr>
+        <w:rFonts w:ascii="Wingdings" w:hAnsi="Wingdings" w:hint="default"/>
+        <w:sz w:val="20"/>
+      </w:rPr>
+    </w:lvl>
+  </w:abstractNum>
+  <w:abstractNum w:abstractNumId="8" w15:restartNumberingAfterBreak="0">
     <w:nsid w:val="5B687CBF"/>
     <w:multiLevelType w:val="multilevel"/>
     <w:tmpl w:val="01209E26"/>
@@ -11020,14 +14175,336 @@
       </w:rPr>
     </w:lvl>
   </w:abstractNum>
+  <w:abstractNum w:abstractNumId="9" w15:restartNumberingAfterBreak="0">
+    <w:nsid w:val="613C755D"/>
+    <w:multiLevelType w:val="multilevel"/>
+    <w:tmpl w:val="92928268"/>
+    <w:lvl w:ilvl="0">
+      <w:start w:val="1"/>
+      <w:numFmt w:val="bullet"/>
+      <w:lvlText w:val=""/>
+      <w:lvlJc w:val="left"/>
+      <w:pPr>
+        <w:tabs>
+          <w:tab w:val="num" w:pos="720"/>
+        </w:tabs>
+        <w:ind w:left="720" w:hanging="360"/>
+      </w:pPr>
+      <w:rPr>
+        <w:rFonts w:ascii="Symbol" w:hAnsi="Symbol" w:hint="default"/>
+        <w:sz w:val="20"/>
+      </w:rPr>
+    </w:lvl>
+    <w:lvl w:ilvl="1" w:tentative="1">
+      <w:start w:val="1"/>
+      <w:numFmt w:val="bullet"/>
+      <w:lvlText w:val="o"/>
+      <w:lvlJc w:val="left"/>
+      <w:pPr>
+        <w:tabs>
+          <w:tab w:val="num" w:pos="1440"/>
+        </w:tabs>
+        <w:ind w:left="1440" w:hanging="360"/>
+      </w:pPr>
+      <w:rPr>
+        <w:rFonts w:ascii="Courier New" w:hAnsi="Courier New" w:hint="default"/>
+        <w:sz w:val="20"/>
+      </w:rPr>
+    </w:lvl>
+    <w:lvl w:ilvl="2" w:tentative="1">
+      <w:start w:val="1"/>
+      <w:numFmt w:val="bullet"/>
+      <w:lvlText w:val=""/>
+      <w:lvlJc w:val="left"/>
+      <w:pPr>
+        <w:tabs>
+          <w:tab w:val="num" w:pos="2160"/>
+        </w:tabs>
+        <w:ind w:left="2160" w:hanging="360"/>
+      </w:pPr>
+      <w:rPr>
+        <w:rFonts w:ascii="Wingdings" w:hAnsi="Wingdings" w:hint="default"/>
+        <w:sz w:val="20"/>
+      </w:rPr>
+    </w:lvl>
+    <w:lvl w:ilvl="3" w:tentative="1">
+      <w:start w:val="1"/>
+      <w:numFmt w:val="bullet"/>
+      <w:lvlText w:val=""/>
+      <w:lvlJc w:val="left"/>
+      <w:pPr>
+        <w:tabs>
+          <w:tab w:val="num" w:pos="2880"/>
+        </w:tabs>
+        <w:ind w:left="2880" w:hanging="360"/>
+      </w:pPr>
+      <w:rPr>
+        <w:rFonts w:ascii="Wingdings" w:hAnsi="Wingdings" w:hint="default"/>
+        <w:sz w:val="20"/>
+      </w:rPr>
+    </w:lvl>
+    <w:lvl w:ilvl="4" w:tentative="1">
+      <w:start w:val="1"/>
+      <w:numFmt w:val="bullet"/>
+      <w:lvlText w:val=""/>
+      <w:lvlJc w:val="left"/>
+      <w:pPr>
+        <w:tabs>
+          <w:tab w:val="num" w:pos="3600"/>
+        </w:tabs>
+        <w:ind w:left="3600" w:hanging="360"/>
+      </w:pPr>
+      <w:rPr>
+        <w:rFonts w:ascii="Wingdings" w:hAnsi="Wingdings" w:hint="default"/>
+        <w:sz w:val="20"/>
+      </w:rPr>
+    </w:lvl>
+    <w:lvl w:ilvl="5" w:tentative="1">
+      <w:start w:val="1"/>
+      <w:numFmt w:val="bullet"/>
+      <w:lvlText w:val=""/>
+      <w:lvlJc w:val="left"/>
+      <w:pPr>
+        <w:tabs>
+          <w:tab w:val="num" w:pos="4320"/>
+        </w:tabs>
+        <w:ind w:left="4320" w:hanging="360"/>
+      </w:pPr>
+      <w:rPr>
+        <w:rFonts w:ascii="Wingdings" w:hAnsi="Wingdings" w:hint="default"/>
+        <w:sz w:val="20"/>
+      </w:rPr>
+    </w:lvl>
+    <w:lvl w:ilvl="6" w:tentative="1">
+      <w:start w:val="1"/>
+      <w:numFmt w:val="bullet"/>
+      <w:lvlText w:val=""/>
+      <w:lvlJc w:val="left"/>
+      <w:pPr>
+        <w:tabs>
+          <w:tab w:val="num" w:pos="5040"/>
+        </w:tabs>
+        <w:ind w:left="5040" w:hanging="360"/>
+      </w:pPr>
+      <w:rPr>
+        <w:rFonts w:ascii="Wingdings" w:hAnsi="Wingdings" w:hint="default"/>
+        <w:sz w:val="20"/>
+      </w:rPr>
+    </w:lvl>
+    <w:lvl w:ilvl="7" w:tentative="1">
+      <w:start w:val="1"/>
+      <w:numFmt w:val="bullet"/>
+      <w:lvlText w:val=""/>
+      <w:lvlJc w:val="left"/>
+      <w:pPr>
+        <w:tabs>
+          <w:tab w:val="num" w:pos="5760"/>
+        </w:tabs>
+        <w:ind w:left="5760" w:hanging="360"/>
+      </w:pPr>
+      <w:rPr>
+        <w:rFonts w:ascii="Wingdings" w:hAnsi="Wingdings" w:hint="default"/>
+        <w:sz w:val="20"/>
+      </w:rPr>
+    </w:lvl>
+    <w:lvl w:ilvl="8" w:tentative="1">
+      <w:start w:val="1"/>
+      <w:numFmt w:val="bullet"/>
+      <w:lvlText w:val=""/>
+      <w:lvlJc w:val="left"/>
+      <w:pPr>
+        <w:tabs>
+          <w:tab w:val="num" w:pos="6480"/>
+        </w:tabs>
+        <w:ind w:left="6480" w:hanging="360"/>
+      </w:pPr>
+      <w:rPr>
+        <w:rFonts w:ascii="Wingdings" w:hAnsi="Wingdings" w:hint="default"/>
+        <w:sz w:val="20"/>
+      </w:rPr>
+    </w:lvl>
+  </w:abstractNum>
+  <w:abstractNum w:abstractNumId="10" w15:restartNumberingAfterBreak="0">
+    <w:nsid w:val="62007472"/>
+    <w:multiLevelType w:val="multilevel"/>
+    <w:tmpl w:val="191CC32E"/>
+    <w:lvl w:ilvl="0">
+      <w:start w:val="1"/>
+      <w:numFmt w:val="bullet"/>
+      <w:lvlText w:val=""/>
+      <w:lvlJc w:val="left"/>
+      <w:pPr>
+        <w:tabs>
+          <w:tab w:val="num" w:pos="720"/>
+        </w:tabs>
+        <w:ind w:left="720" w:hanging="360"/>
+      </w:pPr>
+      <w:rPr>
+        <w:rFonts w:ascii="Symbol" w:hAnsi="Symbol" w:hint="default"/>
+        <w:sz w:val="20"/>
+      </w:rPr>
+    </w:lvl>
+    <w:lvl w:ilvl="1" w:tentative="1">
+      <w:start w:val="1"/>
+      <w:numFmt w:val="bullet"/>
+      <w:lvlText w:val="o"/>
+      <w:lvlJc w:val="left"/>
+      <w:pPr>
+        <w:tabs>
+          <w:tab w:val="num" w:pos="1440"/>
+        </w:tabs>
+        <w:ind w:left="1440" w:hanging="360"/>
+      </w:pPr>
+      <w:rPr>
+        <w:rFonts w:ascii="Courier New" w:hAnsi="Courier New" w:hint="default"/>
+        <w:sz w:val="20"/>
+      </w:rPr>
+    </w:lvl>
+    <w:lvl w:ilvl="2" w:tentative="1">
+      <w:start w:val="1"/>
+      <w:numFmt w:val="bullet"/>
+      <w:lvlText w:val=""/>
+      <w:lvlJc w:val="left"/>
+      <w:pPr>
+        <w:tabs>
+          <w:tab w:val="num" w:pos="2160"/>
+        </w:tabs>
+        <w:ind w:left="2160" w:hanging="360"/>
+      </w:pPr>
+      <w:rPr>
+        <w:rFonts w:ascii="Wingdings" w:hAnsi="Wingdings" w:hint="default"/>
+        <w:sz w:val="20"/>
+      </w:rPr>
+    </w:lvl>
+    <w:lvl w:ilvl="3" w:tentative="1">
+      <w:start w:val="1"/>
+      <w:numFmt w:val="bullet"/>
+      <w:lvlText w:val=""/>
+      <w:lvlJc w:val="left"/>
+      <w:pPr>
+        <w:tabs>
+          <w:tab w:val="num" w:pos="2880"/>
+        </w:tabs>
+        <w:ind w:left="2880" w:hanging="360"/>
+      </w:pPr>
+      <w:rPr>
+        <w:rFonts w:ascii="Wingdings" w:hAnsi="Wingdings" w:hint="default"/>
+        <w:sz w:val="20"/>
+      </w:rPr>
+    </w:lvl>
+    <w:lvl w:ilvl="4" w:tentative="1">
+      <w:start w:val="1"/>
+      <w:numFmt w:val="bullet"/>
+      <w:lvlText w:val=""/>
+      <w:lvlJc w:val="left"/>
+      <w:pPr>
+        <w:tabs>
+          <w:tab w:val="num" w:pos="3600"/>
+        </w:tabs>
+        <w:ind w:left="3600" w:hanging="360"/>
+      </w:pPr>
+      <w:rPr>
+        <w:rFonts w:ascii="Wingdings" w:hAnsi="Wingdings" w:hint="default"/>
+        <w:sz w:val="20"/>
+      </w:rPr>
+    </w:lvl>
+    <w:lvl w:ilvl="5" w:tentative="1">
+      <w:start w:val="1"/>
+      <w:numFmt w:val="bullet"/>
+      <w:lvlText w:val=""/>
+      <w:lvlJc w:val="left"/>
+      <w:pPr>
+        <w:tabs>
+          <w:tab w:val="num" w:pos="4320"/>
+        </w:tabs>
+        <w:ind w:left="4320" w:hanging="360"/>
+      </w:pPr>
+      <w:rPr>
+        <w:rFonts w:ascii="Wingdings" w:hAnsi="Wingdings" w:hint="default"/>
+        <w:sz w:val="20"/>
+      </w:rPr>
+    </w:lvl>
+    <w:lvl w:ilvl="6" w:tentative="1">
+      <w:start w:val="1"/>
+      <w:numFmt w:val="bullet"/>
+      <w:lvlText w:val=""/>
+      <w:lvlJc w:val="left"/>
+      <w:pPr>
+        <w:tabs>
+          <w:tab w:val="num" w:pos="5040"/>
+        </w:tabs>
+        <w:ind w:left="5040" w:hanging="360"/>
+      </w:pPr>
+      <w:rPr>
+        <w:rFonts w:ascii="Wingdings" w:hAnsi="Wingdings" w:hint="default"/>
+        <w:sz w:val="20"/>
+      </w:rPr>
+    </w:lvl>
+    <w:lvl w:ilvl="7" w:tentative="1">
+      <w:start w:val="1"/>
+      <w:numFmt w:val="bullet"/>
+      <w:lvlText w:val=""/>
+      <w:lvlJc w:val="left"/>
+      <w:pPr>
+        <w:tabs>
+          <w:tab w:val="num" w:pos="5760"/>
+        </w:tabs>
+        <w:ind w:left="5760" w:hanging="360"/>
+      </w:pPr>
+      <w:rPr>
+        <w:rFonts w:ascii="Wingdings" w:hAnsi="Wingdings" w:hint="default"/>
+        <w:sz w:val="20"/>
+      </w:rPr>
+    </w:lvl>
+    <w:lvl w:ilvl="8" w:tentative="1">
+      <w:start w:val="1"/>
+      <w:numFmt w:val="bullet"/>
+      <w:lvlText w:val=""/>
+      <w:lvlJc w:val="left"/>
+      <w:pPr>
+        <w:tabs>
+          <w:tab w:val="num" w:pos="6480"/>
+        </w:tabs>
+        <w:ind w:left="6480" w:hanging="360"/>
+      </w:pPr>
+      <w:rPr>
+        <w:rFonts w:ascii="Wingdings" w:hAnsi="Wingdings" w:hint="default"/>
+        <w:sz w:val="20"/>
+      </w:rPr>
+    </w:lvl>
+  </w:abstractNum>
   <w:num w:numId="1" w16cid:durableId="1227837670">
+    <w:abstractNumId w:val="4"/>
+  </w:num>
+  <w:num w:numId="2" w16cid:durableId="1602227819">
+    <w:abstractNumId w:val="6"/>
+  </w:num>
+  <w:num w:numId="3" w16cid:durableId="1297948873">
+    <w:abstractNumId w:val="8"/>
+  </w:num>
+  <w:num w:numId="4" w16cid:durableId="800684227">
+    <w:abstractNumId w:val="9"/>
+  </w:num>
+  <w:num w:numId="5" w16cid:durableId="1852794860">
+    <w:abstractNumId w:val="3"/>
+  </w:num>
+  <w:num w:numId="6" w16cid:durableId="1810593438">
+    <w:abstractNumId w:val="2"/>
+  </w:num>
+  <w:num w:numId="7" w16cid:durableId="588275355">
+    <w:abstractNumId w:val="10"/>
+  </w:num>
+  <w:num w:numId="8" w16cid:durableId="897713987">
+    <w:abstractNumId w:val="5"/>
+  </w:num>
+  <w:num w:numId="9" w16cid:durableId="188757669">
+    <w:abstractNumId w:val="7"/>
+  </w:num>
+  <w:num w:numId="10" w16cid:durableId="566887370">
     <w:abstractNumId w:val="0"/>
   </w:num>
-  <w:num w:numId="2" w16cid:durableId="1602227819">
+  <w:num w:numId="11" w16cid:durableId="1421440190">
     <w:abstractNumId w:val="1"/>
-  </w:num>
-  <w:num w:numId="3" w16cid:durableId="1297948873">
-    <w:abstractNumId w:val="2"/>
   </w:num>
 </w:numbering>
 </file>

</xml_diff>